<commit_message>
Make the template build strictly two-column (A4, 0.75in margins, 3.28in columns) with the title block spanning the full width; size tables and the figure to the column and keep tables intact across breaks
</commit_message>
<xml_diff>
--- a/manuscript/manuscript.docx
+++ b/manuscript/manuscript.docx
@@ -92,6 +92,17 @@
     </w:p>
     <w:p>
       <w:pPr>
+        <w:sectPr>
+          <w:type w:val="continuous"/>
+          <w:pgSz w:w="595.30pt" w:h="841.90pt" w:code="9"/>
+          <w:pgMar w:top="54pt" w:right="1080" w:bottom="72pt" w:left="1080" w:header="36pt" w:footer="36pt" w:gutter="0pt"/>
+          <w:cols w:space="288" w:num="1" w:equalWidth="1"/>
+          <w:docGrid w:linePitch="360"/>
+        </w:sectPr>
+      </w:pPr>
+    </w:p>
+    <w:p>
+      <w:pPr>
         <w:pStyle w:val="Heading1"/>
       </w:pPr>
       <w:r>
@@ -301,6 +312,7 @@
     <w:p>
       <w:pPr>
         <w:pStyle w:val="tablehead"/>
+        <w:keepNext/>
       </w:pPr>
       <w:r>
         <w:rPr>
@@ -313,7 +325,6 @@
       <w:tblPr>
         <w:tblW w:type="auto" w:w="0"/>
         <w:jc w:val="center"/>
-        <w:tblLayout w:type="fixed"/>
         <w:tblLook w:firstColumn="1" w:firstRow="1" w:lastColumn="0" w:lastRow="0" w:noHBand="0" w:noVBand="1" w:val="04A0"/>
         <w:tblBorders>
           <w:top w:val="single" w:sz="6" w:space="0" w:color="000000"/>
@@ -323,12 +334,19 @@
           <w:insideH w:val="none" w:sz="0" w:space="0" w:color="000000"/>
           <w:insideV w:val="none" w:sz="0" w:space="0" w:color="000000"/>
         </w:tblBorders>
+        <w:tblLayout w:type="fixed"/>
+        <w:tblCellMar>
+          <w:top w:w="0" w:type="dxa"/>
+          <w:left w:w="40" w:type="dxa"/>
+          <w:bottom w:w="0" w:type="dxa"/>
+          <w:right w:w="40" w:type="dxa"/>
+        </w:tblCellMar>
       </w:tblPr>
       <w:tblGrid>
-        <w:gridCol w:w="2088"/>
-        <w:gridCol w:w="1944"/>
-        <w:gridCol w:w="1944"/>
-        <w:gridCol w:w="1944"/>
+        <w:gridCol w:w="1757"/>
+        <w:gridCol w:w="994"/>
+        <w:gridCol w:w="994"/>
+        <w:gridCol w:w="979"/>
       </w:tblGrid>
       <w:tr>
         <w:trPr>
@@ -337,7 +355,7 @@
         </w:trPr>
         <w:tc>
           <w:tcPr>
-            <w:tcW w:type="dxa" w:w="2088"/>
+            <w:tcW w:type="dxa" w:w="1757"/>
             <w:tcBorders>
               <w:bottom w:val="single" w:sz="6" w:space="0" w:color="000000"/>
             </w:tcBorders>
@@ -345,6 +363,7 @@
           <w:p>
             <w:pPr>
               <w:pStyle w:val="tablecolhead"/>
+              <w:keepNext/>
             </w:pPr>
             <w:r>
               <w:rPr>
@@ -356,7 +375,7 @@
         </w:tc>
         <w:tc>
           <w:tcPr>
-            <w:tcW w:type="dxa" w:w="1944"/>
+            <w:tcW w:type="dxa" w:w="994"/>
             <w:tcBorders>
               <w:bottom w:val="single" w:sz="6" w:space="0" w:color="000000"/>
             </w:tcBorders>
@@ -364,6 +383,7 @@
           <w:p>
             <w:pPr>
               <w:pStyle w:val="tablecolhead"/>
+              <w:keepNext/>
             </w:pPr>
             <w:r>
               <w:rPr>
@@ -375,7 +395,7 @@
         </w:tc>
         <w:tc>
           <w:tcPr>
-            <w:tcW w:type="dxa" w:w="1944"/>
+            <w:tcW w:type="dxa" w:w="994"/>
             <w:tcBorders>
               <w:bottom w:val="single" w:sz="6" w:space="0" w:color="000000"/>
             </w:tcBorders>
@@ -383,6 +403,7 @@
           <w:p>
             <w:pPr>
               <w:pStyle w:val="tablecolhead"/>
+              <w:keepNext/>
             </w:pPr>
             <w:r>
               <w:rPr>
@@ -394,7 +415,7 @@
         </w:tc>
         <w:tc>
           <w:tcPr>
-            <w:tcW w:type="dxa" w:w="1944"/>
+            <w:tcW w:type="dxa" w:w="979"/>
             <w:tcBorders>
               <w:bottom w:val="single" w:sz="6" w:space="0" w:color="000000"/>
             </w:tcBorders>
@@ -402,6 +423,7 @@
           <w:p>
             <w:pPr>
               <w:pStyle w:val="tablecolhead"/>
+              <w:keepNext/>
             </w:pPr>
             <w:r>
               <w:rPr>
@@ -418,11 +440,12 @@
         </w:trPr>
         <w:tc>
           <w:tcPr>
-            <w:tcW w:type="dxa" w:w="2088"/>
-          </w:tcPr>
-          <w:p>
-            <w:pPr>
-              <w:pStyle w:val="tablecopy"/>
+            <w:tcW w:type="dxa" w:w="1757"/>
+          </w:tcPr>
+          <w:p>
+            <w:pPr>
+              <w:pStyle w:val="tablecopy"/>
+              <w:keepNext/>
             </w:pPr>
             <w:r>
               <w:rPr>
@@ -434,11 +457,12 @@
         </w:tc>
         <w:tc>
           <w:tcPr>
-            <w:tcW w:type="dxa" w:w="1944"/>
-          </w:tcPr>
-          <w:p>
-            <w:pPr>
-              <w:pStyle w:val="tablecopy"/>
+            <w:tcW w:type="dxa" w:w="994"/>
+          </w:tcPr>
+          <w:p>
+            <w:pPr>
+              <w:pStyle w:val="tablecopy"/>
+              <w:keepNext/>
             </w:pPr>
             <w:r>
               <w:rPr>
@@ -450,11 +474,12 @@
         </w:tc>
         <w:tc>
           <w:tcPr>
-            <w:tcW w:type="dxa" w:w="1944"/>
-          </w:tcPr>
-          <w:p>
-            <w:pPr>
-              <w:pStyle w:val="tablecopy"/>
+            <w:tcW w:type="dxa" w:w="994"/>
+          </w:tcPr>
+          <w:p>
+            <w:pPr>
+              <w:pStyle w:val="tablecopy"/>
+              <w:keepNext/>
             </w:pPr>
             <w:r>
               <w:rPr>
@@ -466,11 +491,12 @@
         </w:tc>
         <w:tc>
           <w:tcPr>
-            <w:tcW w:type="dxa" w:w="1944"/>
-          </w:tcPr>
-          <w:p>
-            <w:pPr>
-              <w:pStyle w:val="tablecopy"/>
+            <w:tcW w:type="dxa" w:w="979"/>
+          </w:tcPr>
+          <w:p>
+            <w:pPr>
+              <w:pStyle w:val="tablecopy"/>
+              <w:keepNext/>
             </w:pPr>
             <w:r>
               <w:rPr>
@@ -487,11 +513,12 @@
         </w:trPr>
         <w:tc>
           <w:tcPr>
-            <w:tcW w:type="dxa" w:w="2088"/>
-          </w:tcPr>
-          <w:p>
-            <w:pPr>
-              <w:pStyle w:val="tablecopy"/>
+            <w:tcW w:type="dxa" w:w="1757"/>
+          </w:tcPr>
+          <w:p>
+            <w:pPr>
+              <w:pStyle w:val="tablecopy"/>
+              <w:keepNext/>
             </w:pPr>
             <w:r>
               <w:rPr>
@@ -503,11 +530,12 @@
         </w:tc>
         <w:tc>
           <w:tcPr>
-            <w:tcW w:type="dxa" w:w="1944"/>
-          </w:tcPr>
-          <w:p>
-            <w:pPr>
-              <w:pStyle w:val="tablecopy"/>
+            <w:tcW w:type="dxa" w:w="994"/>
+          </w:tcPr>
+          <w:p>
+            <w:pPr>
+              <w:pStyle w:val="tablecopy"/>
+              <w:keepNext/>
             </w:pPr>
             <w:r>
               <w:rPr>
@@ -519,11 +547,12 @@
         </w:tc>
         <w:tc>
           <w:tcPr>
-            <w:tcW w:type="dxa" w:w="1944"/>
-          </w:tcPr>
-          <w:p>
-            <w:pPr>
-              <w:pStyle w:val="tablecopy"/>
+            <w:tcW w:type="dxa" w:w="994"/>
+          </w:tcPr>
+          <w:p>
+            <w:pPr>
+              <w:pStyle w:val="tablecopy"/>
+              <w:keepNext/>
             </w:pPr>
             <w:r>
               <w:rPr>
@@ -535,11 +564,12 @@
         </w:tc>
         <w:tc>
           <w:tcPr>
-            <w:tcW w:type="dxa" w:w="1944"/>
-          </w:tcPr>
-          <w:p>
-            <w:pPr>
-              <w:pStyle w:val="tablecopy"/>
+            <w:tcW w:type="dxa" w:w="979"/>
+          </w:tcPr>
+          <w:p>
+            <w:pPr>
+              <w:pStyle w:val="tablecopy"/>
+              <w:keepNext/>
             </w:pPr>
             <w:r>
               <w:rPr>
@@ -556,11 +586,12 @@
         </w:trPr>
         <w:tc>
           <w:tcPr>
-            <w:tcW w:type="dxa" w:w="2088"/>
-          </w:tcPr>
-          <w:p>
-            <w:pPr>
-              <w:pStyle w:val="tablecopy"/>
+            <w:tcW w:type="dxa" w:w="1757"/>
+          </w:tcPr>
+          <w:p>
+            <w:pPr>
+              <w:pStyle w:val="tablecopy"/>
+              <w:keepNext/>
             </w:pPr>
             <w:r>
               <w:rPr>
@@ -572,11 +603,12 @@
         </w:tc>
         <w:tc>
           <w:tcPr>
-            <w:tcW w:type="dxa" w:w="1944"/>
-          </w:tcPr>
-          <w:p>
-            <w:pPr>
-              <w:pStyle w:val="tablecopy"/>
+            <w:tcW w:type="dxa" w:w="994"/>
+          </w:tcPr>
+          <w:p>
+            <w:pPr>
+              <w:pStyle w:val="tablecopy"/>
+              <w:keepNext/>
             </w:pPr>
             <w:r>
               <w:rPr>
@@ -588,11 +620,12 @@
         </w:tc>
         <w:tc>
           <w:tcPr>
-            <w:tcW w:type="dxa" w:w="1944"/>
-          </w:tcPr>
-          <w:p>
-            <w:pPr>
-              <w:pStyle w:val="tablecopy"/>
+            <w:tcW w:type="dxa" w:w="994"/>
+          </w:tcPr>
+          <w:p>
+            <w:pPr>
+              <w:pStyle w:val="tablecopy"/>
+              <w:keepNext/>
             </w:pPr>
             <w:r>
               <w:rPr>
@@ -604,11 +637,12 @@
         </w:tc>
         <w:tc>
           <w:tcPr>
-            <w:tcW w:type="dxa" w:w="1944"/>
-          </w:tcPr>
-          <w:p>
-            <w:pPr>
-              <w:pStyle w:val="tablecopy"/>
+            <w:tcW w:type="dxa" w:w="979"/>
+          </w:tcPr>
+          <w:p>
+            <w:pPr>
+              <w:pStyle w:val="tablecopy"/>
+              <w:keepNext/>
             </w:pPr>
             <w:r>
               <w:rPr>
@@ -625,7 +659,7 @@
         </w:trPr>
         <w:tc>
           <w:tcPr>
-            <w:tcW w:type="dxa" w:w="2088"/>
+            <w:tcW w:type="dxa" w:w="1757"/>
           </w:tcPr>
           <w:p>
             <w:pPr>
@@ -641,7 +675,7 @@
         </w:tc>
         <w:tc>
           <w:tcPr>
-            <w:tcW w:type="dxa" w:w="1944"/>
+            <w:tcW w:type="dxa" w:w="994"/>
           </w:tcPr>
           <w:p>
             <w:pPr>
@@ -657,7 +691,7 @@
         </w:tc>
         <w:tc>
           <w:tcPr>
-            <w:tcW w:type="dxa" w:w="1944"/>
+            <w:tcW w:type="dxa" w:w="994"/>
           </w:tcPr>
           <w:p>
             <w:pPr>
@@ -673,7 +707,7 @@
         </w:tc>
         <w:tc>
           <w:tcPr>
-            <w:tcW w:type="dxa" w:w="1944"/>
+            <w:tcW w:type="dxa" w:w="979"/>
           </w:tcPr>
           <w:p>
             <w:pPr>
@@ -747,6 +781,7 @@
     <w:p>
       <w:pPr>
         <w:pStyle w:val="tablehead"/>
+        <w:keepNext/>
       </w:pPr>
       <w:r>
         <w:rPr>
@@ -759,7 +794,6 @@
       <w:tblPr>
         <w:tblW w:type="auto" w:w="0"/>
         <w:jc w:val="center"/>
-        <w:tblLayout w:type="fixed"/>
         <w:tblLook w:firstColumn="1" w:firstRow="1" w:lastColumn="0" w:lastRow="0" w:noHBand="0" w:noVBand="1" w:val="04A0"/>
         <w:tblBorders>
           <w:top w:val="single" w:sz="6" w:space="0" w:color="000000"/>
@@ -769,13 +803,20 @@
           <w:insideH w:val="none" w:sz="0" w:space="0" w:color="000000"/>
           <w:insideV w:val="none" w:sz="0" w:space="0" w:color="000000"/>
         </w:tblBorders>
+        <w:tblLayout w:type="fixed"/>
+        <w:tblCellMar>
+          <w:top w:w="0" w:type="dxa"/>
+          <w:left w:w="40" w:type="dxa"/>
+          <w:bottom w:w="0" w:type="dxa"/>
+          <w:right w:w="40" w:type="dxa"/>
+        </w:tblCellMar>
       </w:tblPr>
       <w:tblGrid>
-        <w:gridCol w:w="2088"/>
-        <w:gridCol w:w="1440"/>
-        <w:gridCol w:w="1440"/>
-        <w:gridCol w:w="1440"/>
-        <w:gridCol w:w="1440"/>
+        <w:gridCol w:w="1584"/>
+        <w:gridCol w:w="785"/>
+        <w:gridCol w:w="785"/>
+        <w:gridCol w:w="785"/>
+        <w:gridCol w:w="785"/>
       </w:tblGrid>
       <w:tr>
         <w:trPr>
@@ -784,7 +825,7 @@
         </w:trPr>
         <w:tc>
           <w:tcPr>
-            <w:tcW w:type="dxa" w:w="2088"/>
+            <w:tcW w:type="dxa" w:w="1584"/>
             <w:tcBorders>
               <w:bottom w:val="single" w:sz="6" w:space="0" w:color="000000"/>
             </w:tcBorders>
@@ -792,6 +833,7 @@
           <w:p>
             <w:pPr>
               <w:pStyle w:val="tablecolhead"/>
+              <w:keepNext/>
             </w:pPr>
             <w:r>
               <w:rPr>
@@ -803,7 +845,7 @@
         </w:tc>
         <w:tc>
           <w:tcPr>
-            <w:tcW w:type="dxa" w:w="1440"/>
+            <w:tcW w:type="dxa" w:w="785"/>
             <w:tcBorders>
               <w:bottom w:val="single" w:sz="6" w:space="0" w:color="000000"/>
             </w:tcBorders>
@@ -811,6 +853,7 @@
           <w:p>
             <w:pPr>
               <w:pStyle w:val="tablecolhead"/>
+              <w:keepNext/>
             </w:pPr>
             <w:r>
               <w:rPr>
@@ -822,7 +865,7 @@
         </w:tc>
         <w:tc>
           <w:tcPr>
-            <w:tcW w:type="dxa" w:w="1440"/>
+            <w:tcW w:type="dxa" w:w="785"/>
             <w:tcBorders>
               <w:bottom w:val="single" w:sz="6" w:space="0" w:color="000000"/>
             </w:tcBorders>
@@ -830,6 +873,7 @@
           <w:p>
             <w:pPr>
               <w:pStyle w:val="tablecolhead"/>
+              <w:keepNext/>
             </w:pPr>
             <w:r>
               <w:rPr>
@@ -841,7 +885,7 @@
         </w:tc>
         <w:tc>
           <w:tcPr>
-            <w:tcW w:type="dxa" w:w="1440"/>
+            <w:tcW w:type="dxa" w:w="785"/>
             <w:tcBorders>
               <w:bottom w:val="single" w:sz="6" w:space="0" w:color="000000"/>
             </w:tcBorders>
@@ -849,6 +893,7 @@
           <w:p>
             <w:pPr>
               <w:pStyle w:val="tablecolhead"/>
+              <w:keepNext/>
             </w:pPr>
             <w:r>
               <w:rPr>
@@ -860,7 +905,7 @@
         </w:tc>
         <w:tc>
           <w:tcPr>
-            <w:tcW w:type="dxa" w:w="1440"/>
+            <w:tcW w:type="dxa" w:w="785"/>
             <w:tcBorders>
               <w:bottom w:val="single" w:sz="6" w:space="0" w:color="000000"/>
             </w:tcBorders>
@@ -868,6 +913,7 @@
           <w:p>
             <w:pPr>
               <w:pStyle w:val="tablecolhead"/>
+              <w:keepNext/>
             </w:pPr>
             <w:r>
               <w:rPr>
@@ -884,11 +930,12 @@
         </w:trPr>
         <w:tc>
           <w:tcPr>
-            <w:tcW w:type="dxa" w:w="2088"/>
-          </w:tcPr>
-          <w:p>
-            <w:pPr>
-              <w:pStyle w:val="tablecopy"/>
+            <w:tcW w:type="dxa" w:w="1584"/>
+          </w:tcPr>
+          <w:p>
+            <w:pPr>
+              <w:pStyle w:val="tablecopy"/>
+              <w:keepNext/>
             </w:pPr>
             <w:r>
               <w:rPr>
@@ -900,11 +947,12 @@
         </w:tc>
         <w:tc>
           <w:tcPr>
-            <w:tcW w:type="dxa" w:w="1440"/>
-          </w:tcPr>
-          <w:p>
-            <w:pPr>
-              <w:pStyle w:val="tablecopy"/>
+            <w:tcW w:type="dxa" w:w="785"/>
+          </w:tcPr>
+          <w:p>
+            <w:pPr>
+              <w:pStyle w:val="tablecopy"/>
+              <w:keepNext/>
             </w:pPr>
             <w:r>
               <w:rPr>
@@ -916,11 +964,12 @@
         </w:tc>
         <w:tc>
           <w:tcPr>
-            <w:tcW w:type="dxa" w:w="1440"/>
-          </w:tcPr>
-          <w:p>
-            <w:pPr>
-              <w:pStyle w:val="tablecopy"/>
+            <w:tcW w:type="dxa" w:w="785"/>
+          </w:tcPr>
+          <w:p>
+            <w:pPr>
+              <w:pStyle w:val="tablecopy"/>
+              <w:keepNext/>
             </w:pPr>
             <w:r>
               <w:rPr>
@@ -932,11 +981,12 @@
         </w:tc>
         <w:tc>
           <w:tcPr>
-            <w:tcW w:type="dxa" w:w="1440"/>
-          </w:tcPr>
-          <w:p>
-            <w:pPr>
-              <w:pStyle w:val="tablecopy"/>
+            <w:tcW w:type="dxa" w:w="785"/>
+          </w:tcPr>
+          <w:p>
+            <w:pPr>
+              <w:pStyle w:val="tablecopy"/>
+              <w:keepNext/>
             </w:pPr>
             <w:r>
               <w:rPr>
@@ -948,11 +998,12 @@
         </w:tc>
         <w:tc>
           <w:tcPr>
-            <w:tcW w:type="dxa" w:w="1440"/>
-          </w:tcPr>
-          <w:p>
-            <w:pPr>
-              <w:pStyle w:val="tablecopy"/>
+            <w:tcW w:type="dxa" w:w="785"/>
+          </w:tcPr>
+          <w:p>
+            <w:pPr>
+              <w:pStyle w:val="tablecopy"/>
+              <w:keepNext/>
             </w:pPr>
             <w:r>
               <w:rPr>
@@ -969,11 +1020,12 @@
         </w:trPr>
         <w:tc>
           <w:tcPr>
-            <w:tcW w:type="dxa" w:w="2088"/>
-          </w:tcPr>
-          <w:p>
-            <w:pPr>
-              <w:pStyle w:val="tablecopy"/>
+            <w:tcW w:type="dxa" w:w="1584"/>
+          </w:tcPr>
+          <w:p>
+            <w:pPr>
+              <w:pStyle w:val="tablecopy"/>
+              <w:keepNext/>
             </w:pPr>
             <w:r>
               <w:rPr>
@@ -985,11 +1037,12 @@
         </w:tc>
         <w:tc>
           <w:tcPr>
-            <w:tcW w:type="dxa" w:w="1440"/>
-          </w:tcPr>
-          <w:p>
-            <w:pPr>
-              <w:pStyle w:val="tablecopy"/>
+            <w:tcW w:type="dxa" w:w="785"/>
+          </w:tcPr>
+          <w:p>
+            <w:pPr>
+              <w:pStyle w:val="tablecopy"/>
+              <w:keepNext/>
             </w:pPr>
             <w:r>
               <w:rPr>
@@ -1001,11 +1054,12 @@
         </w:tc>
         <w:tc>
           <w:tcPr>
-            <w:tcW w:type="dxa" w:w="1440"/>
-          </w:tcPr>
-          <w:p>
-            <w:pPr>
-              <w:pStyle w:val="tablecopy"/>
+            <w:tcW w:type="dxa" w:w="785"/>
+          </w:tcPr>
+          <w:p>
+            <w:pPr>
+              <w:pStyle w:val="tablecopy"/>
+              <w:keepNext/>
             </w:pPr>
             <w:r>
               <w:rPr>
@@ -1017,11 +1071,12 @@
         </w:tc>
         <w:tc>
           <w:tcPr>
-            <w:tcW w:type="dxa" w:w="1440"/>
-          </w:tcPr>
-          <w:p>
-            <w:pPr>
-              <w:pStyle w:val="tablecopy"/>
+            <w:tcW w:type="dxa" w:w="785"/>
+          </w:tcPr>
+          <w:p>
+            <w:pPr>
+              <w:pStyle w:val="tablecopy"/>
+              <w:keepNext/>
             </w:pPr>
             <w:r>
               <w:rPr>
@@ -1033,11 +1088,12 @@
         </w:tc>
         <w:tc>
           <w:tcPr>
-            <w:tcW w:type="dxa" w:w="1440"/>
-          </w:tcPr>
-          <w:p>
-            <w:pPr>
-              <w:pStyle w:val="tablecopy"/>
+            <w:tcW w:type="dxa" w:w="785"/>
+          </w:tcPr>
+          <w:p>
+            <w:pPr>
+              <w:pStyle w:val="tablecopy"/>
+              <w:keepNext/>
             </w:pPr>
             <w:r>
               <w:rPr>
@@ -1054,11 +1110,12 @@
         </w:trPr>
         <w:tc>
           <w:tcPr>
-            <w:tcW w:type="dxa" w:w="2088"/>
-          </w:tcPr>
-          <w:p>
-            <w:pPr>
-              <w:pStyle w:val="tablecopy"/>
+            <w:tcW w:type="dxa" w:w="1584"/>
+          </w:tcPr>
+          <w:p>
+            <w:pPr>
+              <w:pStyle w:val="tablecopy"/>
+              <w:keepNext/>
             </w:pPr>
             <w:r>
               <w:rPr>
@@ -1070,11 +1127,12 @@
         </w:tc>
         <w:tc>
           <w:tcPr>
-            <w:tcW w:type="dxa" w:w="1440"/>
-          </w:tcPr>
-          <w:p>
-            <w:pPr>
-              <w:pStyle w:val="tablecopy"/>
+            <w:tcW w:type="dxa" w:w="785"/>
+          </w:tcPr>
+          <w:p>
+            <w:pPr>
+              <w:pStyle w:val="tablecopy"/>
+              <w:keepNext/>
             </w:pPr>
             <w:r>
               <w:rPr>
@@ -1086,11 +1144,12 @@
         </w:tc>
         <w:tc>
           <w:tcPr>
-            <w:tcW w:type="dxa" w:w="1440"/>
-          </w:tcPr>
-          <w:p>
-            <w:pPr>
-              <w:pStyle w:val="tablecopy"/>
+            <w:tcW w:type="dxa" w:w="785"/>
+          </w:tcPr>
+          <w:p>
+            <w:pPr>
+              <w:pStyle w:val="tablecopy"/>
+              <w:keepNext/>
             </w:pPr>
             <w:r>
               <w:rPr>
@@ -1102,11 +1161,12 @@
         </w:tc>
         <w:tc>
           <w:tcPr>
-            <w:tcW w:type="dxa" w:w="1440"/>
-          </w:tcPr>
-          <w:p>
-            <w:pPr>
-              <w:pStyle w:val="tablecopy"/>
+            <w:tcW w:type="dxa" w:w="785"/>
+          </w:tcPr>
+          <w:p>
+            <w:pPr>
+              <w:pStyle w:val="tablecopy"/>
+              <w:keepNext/>
             </w:pPr>
             <w:r>
               <w:rPr>
@@ -1118,11 +1178,12 @@
         </w:tc>
         <w:tc>
           <w:tcPr>
-            <w:tcW w:type="dxa" w:w="1440"/>
-          </w:tcPr>
-          <w:p>
-            <w:pPr>
-              <w:pStyle w:val="tablecopy"/>
+            <w:tcW w:type="dxa" w:w="785"/>
+          </w:tcPr>
+          <w:p>
+            <w:pPr>
+              <w:pStyle w:val="tablecopy"/>
+              <w:keepNext/>
             </w:pPr>
             <w:r>
               <w:rPr>
@@ -1139,11 +1200,12 @@
         </w:trPr>
         <w:tc>
           <w:tcPr>
-            <w:tcW w:type="dxa" w:w="2088"/>
-          </w:tcPr>
-          <w:p>
-            <w:pPr>
-              <w:pStyle w:val="tablecopy"/>
+            <w:tcW w:type="dxa" w:w="1584"/>
+          </w:tcPr>
+          <w:p>
+            <w:pPr>
+              <w:pStyle w:val="tablecopy"/>
+              <w:keepNext/>
             </w:pPr>
             <w:r>
               <w:rPr>
@@ -1155,11 +1217,12 @@
         </w:tc>
         <w:tc>
           <w:tcPr>
-            <w:tcW w:type="dxa" w:w="1440"/>
-          </w:tcPr>
-          <w:p>
-            <w:pPr>
-              <w:pStyle w:val="tablecopy"/>
+            <w:tcW w:type="dxa" w:w="785"/>
+          </w:tcPr>
+          <w:p>
+            <w:pPr>
+              <w:pStyle w:val="tablecopy"/>
+              <w:keepNext/>
             </w:pPr>
             <w:r>
               <w:rPr>
@@ -1171,11 +1234,12 @@
         </w:tc>
         <w:tc>
           <w:tcPr>
-            <w:tcW w:type="dxa" w:w="1440"/>
-          </w:tcPr>
-          <w:p>
-            <w:pPr>
-              <w:pStyle w:val="tablecopy"/>
+            <w:tcW w:type="dxa" w:w="785"/>
+          </w:tcPr>
+          <w:p>
+            <w:pPr>
+              <w:pStyle w:val="tablecopy"/>
+              <w:keepNext/>
             </w:pPr>
             <w:r>
               <w:rPr>
@@ -1187,11 +1251,12 @@
         </w:tc>
         <w:tc>
           <w:tcPr>
-            <w:tcW w:type="dxa" w:w="1440"/>
-          </w:tcPr>
-          <w:p>
-            <w:pPr>
-              <w:pStyle w:val="tablecopy"/>
+            <w:tcW w:type="dxa" w:w="785"/>
+          </w:tcPr>
+          <w:p>
+            <w:pPr>
+              <w:pStyle w:val="tablecopy"/>
+              <w:keepNext/>
             </w:pPr>
             <w:r>
               <w:rPr>
@@ -1203,11 +1268,12 @@
         </w:tc>
         <w:tc>
           <w:tcPr>
-            <w:tcW w:type="dxa" w:w="1440"/>
-          </w:tcPr>
-          <w:p>
-            <w:pPr>
-              <w:pStyle w:val="tablecopy"/>
+            <w:tcW w:type="dxa" w:w="785"/>
+          </w:tcPr>
+          <w:p>
+            <w:pPr>
+              <w:pStyle w:val="tablecopy"/>
+              <w:keepNext/>
             </w:pPr>
             <w:r>
               <w:rPr>
@@ -1224,11 +1290,12 @@
         </w:trPr>
         <w:tc>
           <w:tcPr>
-            <w:tcW w:type="dxa" w:w="2088"/>
-          </w:tcPr>
-          <w:p>
-            <w:pPr>
-              <w:pStyle w:val="tablecopy"/>
+            <w:tcW w:type="dxa" w:w="1584"/>
+          </w:tcPr>
+          <w:p>
+            <w:pPr>
+              <w:pStyle w:val="tablecopy"/>
+              <w:keepNext/>
             </w:pPr>
             <w:r>
               <w:rPr>
@@ -1240,11 +1307,12 @@
         </w:tc>
         <w:tc>
           <w:tcPr>
-            <w:tcW w:type="dxa" w:w="1440"/>
-          </w:tcPr>
-          <w:p>
-            <w:pPr>
-              <w:pStyle w:val="tablecopy"/>
+            <w:tcW w:type="dxa" w:w="785"/>
+          </w:tcPr>
+          <w:p>
+            <w:pPr>
+              <w:pStyle w:val="tablecopy"/>
+              <w:keepNext/>
             </w:pPr>
             <w:r>
               <w:rPr>
@@ -1256,11 +1324,12 @@
         </w:tc>
         <w:tc>
           <w:tcPr>
-            <w:tcW w:type="dxa" w:w="1440"/>
-          </w:tcPr>
-          <w:p>
-            <w:pPr>
-              <w:pStyle w:val="tablecopy"/>
+            <w:tcW w:type="dxa" w:w="785"/>
+          </w:tcPr>
+          <w:p>
+            <w:pPr>
+              <w:pStyle w:val="tablecopy"/>
+              <w:keepNext/>
             </w:pPr>
             <w:r>
               <w:rPr>
@@ -1272,11 +1341,12 @@
         </w:tc>
         <w:tc>
           <w:tcPr>
-            <w:tcW w:type="dxa" w:w="1440"/>
-          </w:tcPr>
-          <w:p>
-            <w:pPr>
-              <w:pStyle w:val="tablecopy"/>
+            <w:tcW w:type="dxa" w:w="785"/>
+          </w:tcPr>
+          <w:p>
+            <w:pPr>
+              <w:pStyle w:val="tablecopy"/>
+              <w:keepNext/>
             </w:pPr>
             <w:r>
               <w:rPr>
@@ -1288,11 +1358,12 @@
         </w:tc>
         <w:tc>
           <w:tcPr>
-            <w:tcW w:type="dxa" w:w="1440"/>
-          </w:tcPr>
-          <w:p>
-            <w:pPr>
-              <w:pStyle w:val="tablecopy"/>
+            <w:tcW w:type="dxa" w:w="785"/>
+          </w:tcPr>
+          <w:p>
+            <w:pPr>
+              <w:pStyle w:val="tablecopy"/>
+              <w:keepNext/>
             </w:pPr>
             <w:r>
               <w:rPr>
@@ -1309,11 +1380,12 @@
         </w:trPr>
         <w:tc>
           <w:tcPr>
-            <w:tcW w:type="dxa" w:w="2088"/>
-          </w:tcPr>
-          <w:p>
-            <w:pPr>
-              <w:pStyle w:val="tablecopy"/>
+            <w:tcW w:type="dxa" w:w="1584"/>
+          </w:tcPr>
+          <w:p>
+            <w:pPr>
+              <w:pStyle w:val="tablecopy"/>
+              <w:keepNext/>
             </w:pPr>
             <w:r>
               <w:rPr>
@@ -1325,11 +1397,12 @@
         </w:tc>
         <w:tc>
           <w:tcPr>
-            <w:tcW w:type="dxa" w:w="1440"/>
-          </w:tcPr>
-          <w:p>
-            <w:pPr>
-              <w:pStyle w:val="tablecopy"/>
+            <w:tcW w:type="dxa" w:w="785"/>
+          </w:tcPr>
+          <w:p>
+            <w:pPr>
+              <w:pStyle w:val="tablecopy"/>
+              <w:keepNext/>
             </w:pPr>
             <w:r>
               <w:rPr>
@@ -1341,11 +1414,12 @@
         </w:tc>
         <w:tc>
           <w:tcPr>
-            <w:tcW w:type="dxa" w:w="1440"/>
-          </w:tcPr>
-          <w:p>
-            <w:pPr>
-              <w:pStyle w:val="tablecopy"/>
+            <w:tcW w:type="dxa" w:w="785"/>
+          </w:tcPr>
+          <w:p>
+            <w:pPr>
+              <w:pStyle w:val="tablecopy"/>
+              <w:keepNext/>
             </w:pPr>
             <w:r>
               <w:rPr>
@@ -1357,11 +1431,12 @@
         </w:tc>
         <w:tc>
           <w:tcPr>
-            <w:tcW w:type="dxa" w:w="1440"/>
-          </w:tcPr>
-          <w:p>
-            <w:pPr>
-              <w:pStyle w:val="tablecopy"/>
+            <w:tcW w:type="dxa" w:w="785"/>
+          </w:tcPr>
+          <w:p>
+            <w:pPr>
+              <w:pStyle w:val="tablecopy"/>
+              <w:keepNext/>
             </w:pPr>
             <w:r>
               <w:rPr>
@@ -1373,11 +1448,12 @@
         </w:tc>
         <w:tc>
           <w:tcPr>
-            <w:tcW w:type="dxa" w:w="1440"/>
-          </w:tcPr>
-          <w:p>
-            <w:pPr>
-              <w:pStyle w:val="tablecopy"/>
+            <w:tcW w:type="dxa" w:w="785"/>
+          </w:tcPr>
+          <w:p>
+            <w:pPr>
+              <w:pStyle w:val="tablecopy"/>
+              <w:keepNext/>
             </w:pPr>
             <w:r>
               <w:rPr>
@@ -1394,11 +1470,12 @@
         </w:trPr>
         <w:tc>
           <w:tcPr>
-            <w:tcW w:type="dxa" w:w="2088"/>
-          </w:tcPr>
-          <w:p>
-            <w:pPr>
-              <w:pStyle w:val="tablecopy"/>
+            <w:tcW w:type="dxa" w:w="1584"/>
+          </w:tcPr>
+          <w:p>
+            <w:pPr>
+              <w:pStyle w:val="tablecopy"/>
+              <w:keepNext/>
             </w:pPr>
             <w:r>
               <w:rPr>
@@ -1410,11 +1487,12 @@
         </w:tc>
         <w:tc>
           <w:tcPr>
-            <w:tcW w:type="dxa" w:w="1440"/>
-          </w:tcPr>
-          <w:p>
-            <w:pPr>
-              <w:pStyle w:val="tablecopy"/>
+            <w:tcW w:type="dxa" w:w="785"/>
+          </w:tcPr>
+          <w:p>
+            <w:pPr>
+              <w:pStyle w:val="tablecopy"/>
+              <w:keepNext/>
             </w:pPr>
             <w:r>
               <w:rPr>
@@ -1426,11 +1504,12 @@
         </w:tc>
         <w:tc>
           <w:tcPr>
-            <w:tcW w:type="dxa" w:w="1440"/>
-          </w:tcPr>
-          <w:p>
-            <w:pPr>
-              <w:pStyle w:val="tablecopy"/>
+            <w:tcW w:type="dxa" w:w="785"/>
+          </w:tcPr>
+          <w:p>
+            <w:pPr>
+              <w:pStyle w:val="tablecopy"/>
+              <w:keepNext/>
             </w:pPr>
             <w:r>
               <w:rPr>
@@ -1442,11 +1521,12 @@
         </w:tc>
         <w:tc>
           <w:tcPr>
-            <w:tcW w:type="dxa" w:w="1440"/>
-          </w:tcPr>
-          <w:p>
-            <w:pPr>
-              <w:pStyle w:val="tablecopy"/>
+            <w:tcW w:type="dxa" w:w="785"/>
+          </w:tcPr>
+          <w:p>
+            <w:pPr>
+              <w:pStyle w:val="tablecopy"/>
+              <w:keepNext/>
             </w:pPr>
             <w:r>
               <w:rPr>
@@ -1458,11 +1538,12 @@
         </w:tc>
         <w:tc>
           <w:tcPr>
-            <w:tcW w:type="dxa" w:w="1440"/>
-          </w:tcPr>
-          <w:p>
-            <w:pPr>
-              <w:pStyle w:val="tablecopy"/>
+            <w:tcW w:type="dxa" w:w="785"/>
+          </w:tcPr>
+          <w:p>
+            <w:pPr>
+              <w:pStyle w:val="tablecopy"/>
+              <w:keepNext/>
             </w:pPr>
             <w:r>
               <w:rPr>
@@ -1479,11 +1560,12 @@
         </w:trPr>
         <w:tc>
           <w:tcPr>
-            <w:tcW w:type="dxa" w:w="2088"/>
-          </w:tcPr>
-          <w:p>
-            <w:pPr>
-              <w:pStyle w:val="tablecopy"/>
+            <w:tcW w:type="dxa" w:w="1584"/>
+          </w:tcPr>
+          <w:p>
+            <w:pPr>
+              <w:pStyle w:val="tablecopy"/>
+              <w:keepNext/>
             </w:pPr>
             <w:r>
               <w:rPr>
@@ -1495,11 +1577,12 @@
         </w:tc>
         <w:tc>
           <w:tcPr>
-            <w:tcW w:type="dxa" w:w="1440"/>
-          </w:tcPr>
-          <w:p>
-            <w:pPr>
-              <w:pStyle w:val="tablecopy"/>
+            <w:tcW w:type="dxa" w:w="785"/>
+          </w:tcPr>
+          <w:p>
+            <w:pPr>
+              <w:pStyle w:val="tablecopy"/>
+              <w:keepNext/>
             </w:pPr>
             <w:r>
               <w:rPr>
@@ -1511,11 +1594,12 @@
         </w:tc>
         <w:tc>
           <w:tcPr>
-            <w:tcW w:type="dxa" w:w="1440"/>
-          </w:tcPr>
-          <w:p>
-            <w:pPr>
-              <w:pStyle w:val="tablecopy"/>
+            <w:tcW w:type="dxa" w:w="785"/>
+          </w:tcPr>
+          <w:p>
+            <w:pPr>
+              <w:pStyle w:val="tablecopy"/>
+              <w:keepNext/>
             </w:pPr>
             <w:r>
               <w:rPr>
@@ -1527,11 +1611,12 @@
         </w:tc>
         <w:tc>
           <w:tcPr>
-            <w:tcW w:type="dxa" w:w="1440"/>
-          </w:tcPr>
-          <w:p>
-            <w:pPr>
-              <w:pStyle w:val="tablecopy"/>
+            <w:tcW w:type="dxa" w:w="785"/>
+          </w:tcPr>
+          <w:p>
+            <w:pPr>
+              <w:pStyle w:val="tablecopy"/>
+              <w:keepNext/>
             </w:pPr>
             <w:r>
               <w:rPr>
@@ -1543,11 +1628,12 @@
         </w:tc>
         <w:tc>
           <w:tcPr>
-            <w:tcW w:type="dxa" w:w="1440"/>
-          </w:tcPr>
-          <w:p>
-            <w:pPr>
-              <w:pStyle w:val="tablecopy"/>
+            <w:tcW w:type="dxa" w:w="785"/>
+          </w:tcPr>
+          <w:p>
+            <w:pPr>
+              <w:pStyle w:val="tablecopy"/>
+              <w:keepNext/>
             </w:pPr>
             <w:r>
               <w:rPr>
@@ -1564,7 +1650,7 @@
         </w:trPr>
         <w:tc>
           <w:tcPr>
-            <w:tcW w:type="dxa" w:w="2088"/>
+            <w:tcW w:type="dxa" w:w="1584"/>
           </w:tcPr>
           <w:p>
             <w:pPr>
@@ -1580,7 +1666,7 @@
         </w:tc>
         <w:tc>
           <w:tcPr>
-            <w:tcW w:type="dxa" w:w="1440"/>
+            <w:tcW w:type="dxa" w:w="785"/>
           </w:tcPr>
           <w:p>
             <w:pPr>
@@ -1596,7 +1682,7 @@
         </w:tc>
         <w:tc>
           <w:tcPr>
-            <w:tcW w:type="dxa" w:w="1440"/>
+            <w:tcW w:type="dxa" w:w="785"/>
           </w:tcPr>
           <w:p>
             <w:pPr>
@@ -1612,7 +1698,7 @@
         </w:tc>
         <w:tc>
           <w:tcPr>
-            <w:tcW w:type="dxa" w:w="1440"/>
+            <w:tcW w:type="dxa" w:w="785"/>
           </w:tcPr>
           <w:p>
             <w:pPr>
@@ -1628,7 +1714,7 @@
         </w:tc>
         <w:tc>
           <w:tcPr>
-            <w:tcW w:type="dxa" w:w="1440"/>
+            <w:tcW w:type="dxa" w:w="785"/>
           </w:tcPr>
           <w:p>
             <w:pPr>
@@ -1691,6 +1777,7 @@
     <w:p>
       <w:pPr>
         <w:pStyle w:val="tablehead"/>
+        <w:keepNext/>
       </w:pPr>
       <w:r>
         <w:rPr>
@@ -1703,7 +1790,6 @@
       <w:tblPr>
         <w:tblW w:type="auto" w:w="0"/>
         <w:jc w:val="center"/>
-        <w:tblLayout w:type="fixed"/>
         <w:tblLook w:firstColumn="1" w:firstRow="1" w:lastColumn="0" w:lastRow="0" w:noHBand="0" w:noVBand="1" w:val="04A0"/>
         <w:tblBorders>
           <w:top w:val="single" w:sz="6" w:space="0" w:color="000000"/>
@@ -1713,13 +1799,20 @@
           <w:insideH w:val="none" w:sz="0" w:space="0" w:color="000000"/>
           <w:insideV w:val="none" w:sz="0" w:space="0" w:color="000000"/>
         </w:tblBorders>
+        <w:tblLayout w:type="fixed"/>
+        <w:tblCellMar>
+          <w:top w:w="0" w:type="dxa"/>
+          <w:left w:w="40" w:type="dxa"/>
+          <w:bottom w:w="0" w:type="dxa"/>
+          <w:right w:w="40" w:type="dxa"/>
+        </w:tblCellMar>
       </w:tblPr>
       <w:tblGrid>
-        <w:gridCol w:w="2088"/>
-        <w:gridCol w:w="1440"/>
-        <w:gridCol w:w="1440"/>
-        <w:gridCol w:w="1440"/>
-        <w:gridCol w:w="1440"/>
+        <w:gridCol w:w="1584"/>
+        <w:gridCol w:w="785"/>
+        <w:gridCol w:w="785"/>
+        <w:gridCol w:w="785"/>
+        <w:gridCol w:w="785"/>
       </w:tblGrid>
       <w:tr>
         <w:trPr>
@@ -1728,7 +1821,7 @@
         </w:trPr>
         <w:tc>
           <w:tcPr>
-            <w:tcW w:type="dxa" w:w="2088"/>
+            <w:tcW w:type="dxa" w:w="1584"/>
             <w:tcBorders>
               <w:bottom w:val="single" w:sz="6" w:space="0" w:color="000000"/>
             </w:tcBorders>
@@ -1736,6 +1829,7 @@
           <w:p>
             <w:pPr>
               <w:pStyle w:val="tablecolhead"/>
+              <w:keepNext/>
             </w:pPr>
             <w:r>
               <w:rPr>
@@ -1747,7 +1841,7 @@
         </w:tc>
         <w:tc>
           <w:tcPr>
-            <w:tcW w:type="dxa" w:w="1440"/>
+            <w:tcW w:type="dxa" w:w="785"/>
             <w:tcBorders>
               <w:bottom w:val="single" w:sz="6" w:space="0" w:color="000000"/>
             </w:tcBorders>
@@ -1755,6 +1849,7 @@
           <w:p>
             <w:pPr>
               <w:pStyle w:val="tablecolhead"/>
+              <w:keepNext/>
             </w:pPr>
             <w:r>
               <w:rPr>
@@ -1766,7 +1861,7 @@
         </w:tc>
         <w:tc>
           <w:tcPr>
-            <w:tcW w:type="dxa" w:w="1440"/>
+            <w:tcW w:type="dxa" w:w="785"/>
             <w:tcBorders>
               <w:bottom w:val="single" w:sz="6" w:space="0" w:color="000000"/>
             </w:tcBorders>
@@ -1774,6 +1869,7 @@
           <w:p>
             <w:pPr>
               <w:pStyle w:val="tablecolhead"/>
+              <w:keepNext/>
             </w:pPr>
             <w:r>
               <w:rPr>
@@ -1785,7 +1881,7 @@
         </w:tc>
         <w:tc>
           <w:tcPr>
-            <w:tcW w:type="dxa" w:w="1440"/>
+            <w:tcW w:type="dxa" w:w="785"/>
             <w:tcBorders>
               <w:bottom w:val="single" w:sz="6" w:space="0" w:color="000000"/>
             </w:tcBorders>
@@ -1793,6 +1889,7 @@
           <w:p>
             <w:pPr>
               <w:pStyle w:val="tablecolhead"/>
+              <w:keepNext/>
             </w:pPr>
             <w:r>
               <w:rPr>
@@ -1804,7 +1901,7 @@
         </w:tc>
         <w:tc>
           <w:tcPr>
-            <w:tcW w:type="dxa" w:w="1440"/>
+            <w:tcW w:type="dxa" w:w="785"/>
             <w:tcBorders>
               <w:bottom w:val="single" w:sz="6" w:space="0" w:color="000000"/>
             </w:tcBorders>
@@ -1812,6 +1909,7 @@
           <w:p>
             <w:pPr>
               <w:pStyle w:val="tablecolhead"/>
+              <w:keepNext/>
             </w:pPr>
             <w:r>
               <w:rPr>
@@ -1828,11 +1926,12 @@
         </w:trPr>
         <w:tc>
           <w:tcPr>
-            <w:tcW w:type="dxa" w:w="2088"/>
-          </w:tcPr>
-          <w:p>
-            <w:pPr>
-              <w:pStyle w:val="tablecopy"/>
+            <w:tcW w:type="dxa" w:w="1584"/>
+          </w:tcPr>
+          <w:p>
+            <w:pPr>
+              <w:pStyle w:val="tablecopy"/>
+              <w:keepNext/>
             </w:pPr>
             <w:r>
               <w:rPr>
@@ -1844,11 +1943,12 @@
         </w:tc>
         <w:tc>
           <w:tcPr>
-            <w:tcW w:type="dxa" w:w="1440"/>
-          </w:tcPr>
-          <w:p>
-            <w:pPr>
-              <w:pStyle w:val="tablecopy"/>
+            <w:tcW w:type="dxa" w:w="785"/>
+          </w:tcPr>
+          <w:p>
+            <w:pPr>
+              <w:pStyle w:val="tablecopy"/>
+              <w:keepNext/>
             </w:pPr>
             <w:r>
               <w:rPr>
@@ -1860,11 +1960,12 @@
         </w:tc>
         <w:tc>
           <w:tcPr>
-            <w:tcW w:type="dxa" w:w="1440"/>
-          </w:tcPr>
-          <w:p>
-            <w:pPr>
-              <w:pStyle w:val="tablecopy"/>
+            <w:tcW w:type="dxa" w:w="785"/>
+          </w:tcPr>
+          <w:p>
+            <w:pPr>
+              <w:pStyle w:val="tablecopy"/>
+              <w:keepNext/>
             </w:pPr>
             <w:r>
               <w:rPr>
@@ -1876,11 +1977,12 @@
         </w:tc>
         <w:tc>
           <w:tcPr>
-            <w:tcW w:type="dxa" w:w="1440"/>
-          </w:tcPr>
-          <w:p>
-            <w:pPr>
-              <w:pStyle w:val="tablecopy"/>
+            <w:tcW w:type="dxa" w:w="785"/>
+          </w:tcPr>
+          <w:p>
+            <w:pPr>
+              <w:pStyle w:val="tablecopy"/>
+              <w:keepNext/>
             </w:pPr>
             <w:r>
               <w:rPr>
@@ -1892,11 +1994,12 @@
         </w:tc>
         <w:tc>
           <w:tcPr>
-            <w:tcW w:type="dxa" w:w="1440"/>
-          </w:tcPr>
-          <w:p>
-            <w:pPr>
-              <w:pStyle w:val="tablecopy"/>
+            <w:tcW w:type="dxa" w:w="785"/>
+          </w:tcPr>
+          <w:p>
+            <w:pPr>
+              <w:pStyle w:val="tablecopy"/>
+              <w:keepNext/>
             </w:pPr>
             <w:r>
               <w:rPr>
@@ -1913,11 +2016,12 @@
         </w:trPr>
         <w:tc>
           <w:tcPr>
-            <w:tcW w:type="dxa" w:w="2088"/>
-          </w:tcPr>
-          <w:p>
-            <w:pPr>
-              <w:pStyle w:val="tablecopy"/>
+            <w:tcW w:type="dxa" w:w="1584"/>
+          </w:tcPr>
+          <w:p>
+            <w:pPr>
+              <w:pStyle w:val="tablecopy"/>
+              <w:keepNext/>
             </w:pPr>
             <w:r>
               <w:rPr>
@@ -1929,11 +2033,12 @@
         </w:tc>
         <w:tc>
           <w:tcPr>
-            <w:tcW w:type="dxa" w:w="1440"/>
-          </w:tcPr>
-          <w:p>
-            <w:pPr>
-              <w:pStyle w:val="tablecopy"/>
+            <w:tcW w:type="dxa" w:w="785"/>
+          </w:tcPr>
+          <w:p>
+            <w:pPr>
+              <w:pStyle w:val="tablecopy"/>
+              <w:keepNext/>
             </w:pPr>
             <w:r>
               <w:rPr>
@@ -1945,11 +2050,12 @@
         </w:tc>
         <w:tc>
           <w:tcPr>
-            <w:tcW w:type="dxa" w:w="1440"/>
-          </w:tcPr>
-          <w:p>
-            <w:pPr>
-              <w:pStyle w:val="tablecopy"/>
+            <w:tcW w:type="dxa" w:w="785"/>
+          </w:tcPr>
+          <w:p>
+            <w:pPr>
+              <w:pStyle w:val="tablecopy"/>
+              <w:keepNext/>
             </w:pPr>
             <w:r>
               <w:rPr>
@@ -1961,11 +2067,12 @@
         </w:tc>
         <w:tc>
           <w:tcPr>
-            <w:tcW w:type="dxa" w:w="1440"/>
-          </w:tcPr>
-          <w:p>
-            <w:pPr>
-              <w:pStyle w:val="tablecopy"/>
+            <w:tcW w:type="dxa" w:w="785"/>
+          </w:tcPr>
+          <w:p>
+            <w:pPr>
+              <w:pStyle w:val="tablecopy"/>
+              <w:keepNext/>
             </w:pPr>
             <w:r>
               <w:rPr>
@@ -1977,11 +2084,12 @@
         </w:tc>
         <w:tc>
           <w:tcPr>
-            <w:tcW w:type="dxa" w:w="1440"/>
-          </w:tcPr>
-          <w:p>
-            <w:pPr>
-              <w:pStyle w:val="tablecopy"/>
+            <w:tcW w:type="dxa" w:w="785"/>
+          </w:tcPr>
+          <w:p>
+            <w:pPr>
+              <w:pStyle w:val="tablecopy"/>
+              <w:keepNext/>
             </w:pPr>
             <w:r>
               <w:rPr>
@@ -1998,11 +2106,12 @@
         </w:trPr>
         <w:tc>
           <w:tcPr>
-            <w:tcW w:type="dxa" w:w="2088"/>
-          </w:tcPr>
-          <w:p>
-            <w:pPr>
-              <w:pStyle w:val="tablecopy"/>
+            <w:tcW w:type="dxa" w:w="1584"/>
+          </w:tcPr>
+          <w:p>
+            <w:pPr>
+              <w:pStyle w:val="tablecopy"/>
+              <w:keepNext/>
             </w:pPr>
             <w:r>
               <w:rPr>
@@ -2014,11 +2123,12 @@
         </w:tc>
         <w:tc>
           <w:tcPr>
-            <w:tcW w:type="dxa" w:w="1440"/>
-          </w:tcPr>
-          <w:p>
-            <w:pPr>
-              <w:pStyle w:val="tablecopy"/>
+            <w:tcW w:type="dxa" w:w="785"/>
+          </w:tcPr>
+          <w:p>
+            <w:pPr>
+              <w:pStyle w:val="tablecopy"/>
+              <w:keepNext/>
             </w:pPr>
             <w:r>
               <w:rPr>
@@ -2030,11 +2140,12 @@
         </w:tc>
         <w:tc>
           <w:tcPr>
-            <w:tcW w:type="dxa" w:w="1440"/>
-          </w:tcPr>
-          <w:p>
-            <w:pPr>
-              <w:pStyle w:val="tablecopy"/>
+            <w:tcW w:type="dxa" w:w="785"/>
+          </w:tcPr>
+          <w:p>
+            <w:pPr>
+              <w:pStyle w:val="tablecopy"/>
+              <w:keepNext/>
             </w:pPr>
             <w:r>
               <w:rPr>
@@ -2046,11 +2157,12 @@
         </w:tc>
         <w:tc>
           <w:tcPr>
-            <w:tcW w:type="dxa" w:w="1440"/>
-          </w:tcPr>
-          <w:p>
-            <w:pPr>
-              <w:pStyle w:val="tablecopy"/>
+            <w:tcW w:type="dxa" w:w="785"/>
+          </w:tcPr>
+          <w:p>
+            <w:pPr>
+              <w:pStyle w:val="tablecopy"/>
+              <w:keepNext/>
             </w:pPr>
             <w:r>
               <w:rPr>
@@ -2062,11 +2174,12 @@
         </w:tc>
         <w:tc>
           <w:tcPr>
-            <w:tcW w:type="dxa" w:w="1440"/>
-          </w:tcPr>
-          <w:p>
-            <w:pPr>
-              <w:pStyle w:val="tablecopy"/>
+            <w:tcW w:type="dxa" w:w="785"/>
+          </w:tcPr>
+          <w:p>
+            <w:pPr>
+              <w:pStyle w:val="tablecopy"/>
+              <w:keepNext/>
             </w:pPr>
             <w:r>
               <w:rPr>
@@ -2083,11 +2196,12 @@
         </w:trPr>
         <w:tc>
           <w:tcPr>
-            <w:tcW w:type="dxa" w:w="2088"/>
-          </w:tcPr>
-          <w:p>
-            <w:pPr>
-              <w:pStyle w:val="tablecopy"/>
+            <w:tcW w:type="dxa" w:w="1584"/>
+          </w:tcPr>
+          <w:p>
+            <w:pPr>
+              <w:pStyle w:val="tablecopy"/>
+              <w:keepNext/>
             </w:pPr>
             <w:r>
               <w:rPr>
@@ -2099,11 +2213,12 @@
         </w:tc>
         <w:tc>
           <w:tcPr>
-            <w:tcW w:type="dxa" w:w="1440"/>
-          </w:tcPr>
-          <w:p>
-            <w:pPr>
-              <w:pStyle w:val="tablecopy"/>
+            <w:tcW w:type="dxa" w:w="785"/>
+          </w:tcPr>
+          <w:p>
+            <w:pPr>
+              <w:pStyle w:val="tablecopy"/>
+              <w:keepNext/>
             </w:pPr>
             <w:r>
               <w:rPr>
@@ -2115,11 +2230,12 @@
         </w:tc>
         <w:tc>
           <w:tcPr>
-            <w:tcW w:type="dxa" w:w="1440"/>
-          </w:tcPr>
-          <w:p>
-            <w:pPr>
-              <w:pStyle w:val="tablecopy"/>
+            <w:tcW w:type="dxa" w:w="785"/>
+          </w:tcPr>
+          <w:p>
+            <w:pPr>
+              <w:pStyle w:val="tablecopy"/>
+              <w:keepNext/>
             </w:pPr>
             <w:r>
               <w:rPr>
@@ -2131,11 +2247,12 @@
         </w:tc>
         <w:tc>
           <w:tcPr>
-            <w:tcW w:type="dxa" w:w="1440"/>
-          </w:tcPr>
-          <w:p>
-            <w:pPr>
-              <w:pStyle w:val="tablecopy"/>
+            <w:tcW w:type="dxa" w:w="785"/>
+          </w:tcPr>
+          <w:p>
+            <w:pPr>
+              <w:pStyle w:val="tablecopy"/>
+              <w:keepNext/>
             </w:pPr>
             <w:r>
               <w:rPr>
@@ -2147,11 +2264,12 @@
         </w:tc>
         <w:tc>
           <w:tcPr>
-            <w:tcW w:type="dxa" w:w="1440"/>
-          </w:tcPr>
-          <w:p>
-            <w:pPr>
-              <w:pStyle w:val="tablecopy"/>
+            <w:tcW w:type="dxa" w:w="785"/>
+          </w:tcPr>
+          <w:p>
+            <w:pPr>
+              <w:pStyle w:val="tablecopy"/>
+              <w:keepNext/>
             </w:pPr>
             <w:r>
               <w:rPr>
@@ -2168,11 +2286,12 @@
         </w:trPr>
         <w:tc>
           <w:tcPr>
-            <w:tcW w:type="dxa" w:w="2088"/>
-          </w:tcPr>
-          <w:p>
-            <w:pPr>
-              <w:pStyle w:val="tablecopy"/>
+            <w:tcW w:type="dxa" w:w="1584"/>
+          </w:tcPr>
+          <w:p>
+            <w:pPr>
+              <w:pStyle w:val="tablecopy"/>
+              <w:keepNext/>
             </w:pPr>
             <w:r>
               <w:rPr>
@@ -2184,11 +2303,12 @@
         </w:tc>
         <w:tc>
           <w:tcPr>
-            <w:tcW w:type="dxa" w:w="1440"/>
-          </w:tcPr>
-          <w:p>
-            <w:pPr>
-              <w:pStyle w:val="tablecopy"/>
+            <w:tcW w:type="dxa" w:w="785"/>
+          </w:tcPr>
+          <w:p>
+            <w:pPr>
+              <w:pStyle w:val="tablecopy"/>
+              <w:keepNext/>
             </w:pPr>
             <w:r>
               <w:rPr>
@@ -2200,11 +2320,12 @@
         </w:tc>
         <w:tc>
           <w:tcPr>
-            <w:tcW w:type="dxa" w:w="1440"/>
-          </w:tcPr>
-          <w:p>
-            <w:pPr>
-              <w:pStyle w:val="tablecopy"/>
+            <w:tcW w:type="dxa" w:w="785"/>
+          </w:tcPr>
+          <w:p>
+            <w:pPr>
+              <w:pStyle w:val="tablecopy"/>
+              <w:keepNext/>
             </w:pPr>
             <w:r>
               <w:rPr>
@@ -2216,11 +2337,12 @@
         </w:tc>
         <w:tc>
           <w:tcPr>
-            <w:tcW w:type="dxa" w:w="1440"/>
-          </w:tcPr>
-          <w:p>
-            <w:pPr>
-              <w:pStyle w:val="tablecopy"/>
+            <w:tcW w:type="dxa" w:w="785"/>
+          </w:tcPr>
+          <w:p>
+            <w:pPr>
+              <w:pStyle w:val="tablecopy"/>
+              <w:keepNext/>
             </w:pPr>
             <w:r>
               <w:rPr>
@@ -2232,11 +2354,12 @@
         </w:tc>
         <w:tc>
           <w:tcPr>
-            <w:tcW w:type="dxa" w:w="1440"/>
-          </w:tcPr>
-          <w:p>
-            <w:pPr>
-              <w:pStyle w:val="tablecopy"/>
+            <w:tcW w:type="dxa" w:w="785"/>
+          </w:tcPr>
+          <w:p>
+            <w:pPr>
+              <w:pStyle w:val="tablecopy"/>
+              <w:keepNext/>
             </w:pPr>
             <w:r>
               <w:rPr>
@@ -2253,7 +2376,7 @@
         </w:trPr>
         <w:tc>
           <w:tcPr>
-            <w:tcW w:type="dxa" w:w="2088"/>
+            <w:tcW w:type="dxa" w:w="1584"/>
           </w:tcPr>
           <w:p>
             <w:pPr>
@@ -2269,7 +2392,7 @@
         </w:tc>
         <w:tc>
           <w:tcPr>
-            <w:tcW w:type="dxa" w:w="1440"/>
+            <w:tcW w:type="dxa" w:w="785"/>
           </w:tcPr>
           <w:p>
             <w:pPr>
@@ -2285,7 +2408,7 @@
         </w:tc>
         <w:tc>
           <w:tcPr>
-            <w:tcW w:type="dxa" w:w="1440"/>
+            <w:tcW w:type="dxa" w:w="785"/>
           </w:tcPr>
           <w:p>
             <w:pPr>
@@ -2301,7 +2424,7 @@
         </w:tc>
         <w:tc>
           <w:tcPr>
-            <w:tcW w:type="dxa" w:w="1440"/>
+            <w:tcW w:type="dxa" w:w="785"/>
           </w:tcPr>
           <w:p>
             <w:pPr>
@@ -2317,7 +2440,7 @@
         </w:tc>
         <w:tc>
           <w:tcPr>
-            <w:tcW w:type="dxa" w:w="1440"/>
+            <w:tcW w:type="dxa" w:w="785"/>
           </w:tcPr>
           <w:p>
             <w:pPr>
@@ -2380,6 +2503,7 @@
     <w:p>
       <w:pPr>
         <w:pStyle w:val="tablehead"/>
+        <w:keepNext/>
       </w:pPr>
       <w:r>
         <w:rPr>
@@ -2392,7 +2516,6 @@
       <w:tblPr>
         <w:tblW w:type="auto" w:w="0"/>
         <w:jc w:val="center"/>
-        <w:tblLayout w:type="fixed"/>
         <w:tblLook w:firstColumn="1" w:firstRow="1" w:lastColumn="0" w:lastRow="0" w:noHBand="0" w:noVBand="1" w:val="04A0"/>
         <w:tblBorders>
           <w:top w:val="single" w:sz="6" w:space="0" w:color="000000"/>
@@ -2402,14 +2525,21 @@
           <w:insideH w:val="none" w:sz="0" w:space="0" w:color="000000"/>
           <w:insideV w:val="none" w:sz="0" w:space="0" w:color="000000"/>
         </w:tblBorders>
+        <w:tblLayout w:type="fixed"/>
+        <w:tblCellMar>
+          <w:top w:w="0" w:type="dxa"/>
+          <w:left w:w="40" w:type="dxa"/>
+          <w:bottom w:w="0" w:type="dxa"/>
+          <w:right w:w="40" w:type="dxa"/>
+        </w:tblCellMar>
       </w:tblPr>
       <w:tblGrid>
-        <w:gridCol w:w="2088"/>
-        <w:gridCol w:w="1152"/>
-        <w:gridCol w:w="1152"/>
-        <w:gridCol w:w="1152"/>
-        <w:gridCol w:w="1152"/>
-        <w:gridCol w:w="1152"/>
+        <w:gridCol w:w="1368"/>
+        <w:gridCol w:w="648"/>
+        <w:gridCol w:w="648"/>
+        <w:gridCol w:w="648"/>
+        <w:gridCol w:w="720"/>
+        <w:gridCol w:w="691"/>
       </w:tblGrid>
       <w:tr>
         <w:trPr>
@@ -2418,7 +2548,7 @@
         </w:trPr>
         <w:tc>
           <w:tcPr>
-            <w:tcW w:type="dxa" w:w="2088"/>
+            <w:tcW w:type="dxa" w:w="1368"/>
             <w:tcBorders>
               <w:bottom w:val="single" w:sz="6" w:space="0" w:color="000000"/>
             </w:tcBorders>
@@ -2426,6 +2556,7 @@
           <w:p>
             <w:pPr>
               <w:pStyle w:val="tablecolhead"/>
+              <w:keepNext/>
             </w:pPr>
             <w:r>
               <w:rPr>
@@ -2437,7 +2568,7 @@
         </w:tc>
         <w:tc>
           <w:tcPr>
-            <w:tcW w:type="dxa" w:w="1152"/>
+            <w:tcW w:type="dxa" w:w="648"/>
             <w:tcBorders>
               <w:bottom w:val="single" w:sz="6" w:space="0" w:color="000000"/>
             </w:tcBorders>
@@ -2445,6 +2576,7 @@
           <w:p>
             <w:pPr>
               <w:pStyle w:val="tablecolhead"/>
+              <w:keepNext/>
             </w:pPr>
             <w:r>
               <w:rPr>
@@ -2456,7 +2588,7 @@
         </w:tc>
         <w:tc>
           <w:tcPr>
-            <w:tcW w:type="dxa" w:w="1152"/>
+            <w:tcW w:type="dxa" w:w="648"/>
             <w:tcBorders>
               <w:bottom w:val="single" w:sz="6" w:space="0" w:color="000000"/>
             </w:tcBorders>
@@ -2464,6 +2596,7 @@
           <w:p>
             <w:pPr>
               <w:pStyle w:val="tablecolhead"/>
+              <w:keepNext/>
             </w:pPr>
             <w:r>
               <w:rPr>
@@ -2475,7 +2608,7 @@
         </w:tc>
         <w:tc>
           <w:tcPr>
-            <w:tcW w:type="dxa" w:w="1152"/>
+            <w:tcW w:type="dxa" w:w="648"/>
             <w:tcBorders>
               <w:bottom w:val="single" w:sz="6" w:space="0" w:color="000000"/>
             </w:tcBorders>
@@ -2483,6 +2616,7 @@
           <w:p>
             <w:pPr>
               <w:pStyle w:val="tablecolhead"/>
+              <w:keepNext/>
             </w:pPr>
             <w:r>
               <w:rPr>
@@ -2494,7 +2628,7 @@
         </w:tc>
         <w:tc>
           <w:tcPr>
-            <w:tcW w:type="dxa" w:w="1152"/>
+            <w:tcW w:type="dxa" w:w="720"/>
             <w:tcBorders>
               <w:bottom w:val="single" w:sz="6" w:space="0" w:color="000000"/>
             </w:tcBorders>
@@ -2502,6 +2636,7 @@
           <w:p>
             <w:pPr>
               <w:pStyle w:val="tablecolhead"/>
+              <w:keepNext/>
             </w:pPr>
             <w:r>
               <w:rPr>
@@ -2513,7 +2648,7 @@
         </w:tc>
         <w:tc>
           <w:tcPr>
-            <w:tcW w:type="dxa" w:w="1152"/>
+            <w:tcW w:type="dxa" w:w="691"/>
             <w:tcBorders>
               <w:bottom w:val="single" w:sz="6" w:space="0" w:color="000000"/>
             </w:tcBorders>
@@ -2521,6 +2656,7 @@
           <w:p>
             <w:pPr>
               <w:pStyle w:val="tablecolhead"/>
+              <w:keepNext/>
             </w:pPr>
             <w:r>
               <w:rPr>
@@ -2537,12 +2673,13 @@
         </w:trPr>
         <w:tc>
           <w:tcPr>
-            <w:tcW w:type="dxa" w:w="7848"/>
+            <w:tcW w:type="dxa" w:w="4723"/>
             <w:gridSpan w:val="6"/>
           </w:tcPr>
           <w:p>
             <w:pPr>
               <w:pStyle w:val="tablecopy"/>
+              <w:keepNext/>
             </w:pPr>
             <w:r>
               <w:rPr>
@@ -2559,11 +2696,12 @@
         </w:trPr>
         <w:tc>
           <w:tcPr>
-            <w:tcW w:type="dxa" w:w="2088"/>
-          </w:tcPr>
-          <w:p>
-            <w:pPr>
-              <w:pStyle w:val="tablecopy"/>
+            <w:tcW w:type="dxa" w:w="1368"/>
+          </w:tcPr>
+          <w:p>
+            <w:pPr>
+              <w:pStyle w:val="tablecopy"/>
+              <w:keepNext/>
             </w:pPr>
             <w:r>
               <w:rPr>
@@ -2575,11 +2713,12 @@
         </w:tc>
         <w:tc>
           <w:tcPr>
-            <w:tcW w:type="dxa" w:w="1152"/>
-          </w:tcPr>
-          <w:p>
-            <w:pPr>
-              <w:pStyle w:val="tablecopy"/>
+            <w:tcW w:type="dxa" w:w="648"/>
+          </w:tcPr>
+          <w:p>
+            <w:pPr>
+              <w:pStyle w:val="tablecopy"/>
+              <w:keepNext/>
             </w:pPr>
             <w:r>
               <w:rPr>
@@ -2591,11 +2730,12 @@
         </w:tc>
         <w:tc>
           <w:tcPr>
-            <w:tcW w:type="dxa" w:w="1152"/>
-          </w:tcPr>
-          <w:p>
-            <w:pPr>
-              <w:pStyle w:val="tablecopy"/>
+            <w:tcW w:type="dxa" w:w="648"/>
+          </w:tcPr>
+          <w:p>
+            <w:pPr>
+              <w:pStyle w:val="tablecopy"/>
+              <w:keepNext/>
             </w:pPr>
             <w:r>
               <w:rPr>
@@ -2607,11 +2747,12 @@
         </w:tc>
         <w:tc>
           <w:tcPr>
-            <w:tcW w:type="dxa" w:w="1152"/>
-          </w:tcPr>
-          <w:p>
-            <w:pPr>
-              <w:pStyle w:val="tablecopy"/>
+            <w:tcW w:type="dxa" w:w="648"/>
+          </w:tcPr>
+          <w:p>
+            <w:pPr>
+              <w:pStyle w:val="tablecopy"/>
+              <w:keepNext/>
             </w:pPr>
             <w:r>
               <w:rPr>
@@ -2623,11 +2764,12 @@
         </w:tc>
         <w:tc>
           <w:tcPr>
-            <w:tcW w:type="dxa" w:w="1152"/>
-          </w:tcPr>
-          <w:p>
-            <w:pPr>
-              <w:pStyle w:val="tablecopy"/>
+            <w:tcW w:type="dxa" w:w="720"/>
+          </w:tcPr>
+          <w:p>
+            <w:pPr>
+              <w:pStyle w:val="tablecopy"/>
+              <w:keepNext/>
             </w:pPr>
             <w:r>
               <w:rPr>
@@ -2639,11 +2781,12 @@
         </w:tc>
         <w:tc>
           <w:tcPr>
-            <w:tcW w:type="dxa" w:w="1152"/>
-          </w:tcPr>
-          <w:p>
-            <w:pPr>
-              <w:pStyle w:val="tablecopy"/>
+            <w:tcW w:type="dxa" w:w="691"/>
+          </w:tcPr>
+          <w:p>
+            <w:pPr>
+              <w:pStyle w:val="tablecopy"/>
+              <w:keepNext/>
             </w:pPr>
             <w:r>
               <w:rPr>
@@ -2660,11 +2803,12 @@
         </w:trPr>
         <w:tc>
           <w:tcPr>
-            <w:tcW w:type="dxa" w:w="2088"/>
-          </w:tcPr>
-          <w:p>
-            <w:pPr>
-              <w:pStyle w:val="tablecopy"/>
+            <w:tcW w:type="dxa" w:w="1368"/>
+          </w:tcPr>
+          <w:p>
+            <w:pPr>
+              <w:pStyle w:val="tablecopy"/>
+              <w:keepNext/>
             </w:pPr>
             <w:r>
               <w:rPr>
@@ -2676,11 +2820,12 @@
         </w:tc>
         <w:tc>
           <w:tcPr>
-            <w:tcW w:type="dxa" w:w="1152"/>
-          </w:tcPr>
-          <w:p>
-            <w:pPr>
-              <w:pStyle w:val="tablecopy"/>
+            <w:tcW w:type="dxa" w:w="648"/>
+          </w:tcPr>
+          <w:p>
+            <w:pPr>
+              <w:pStyle w:val="tablecopy"/>
+              <w:keepNext/>
             </w:pPr>
             <w:r>
               <w:rPr>
@@ -2692,11 +2837,12 @@
         </w:tc>
         <w:tc>
           <w:tcPr>
-            <w:tcW w:type="dxa" w:w="1152"/>
-          </w:tcPr>
-          <w:p>
-            <w:pPr>
-              <w:pStyle w:val="tablecopy"/>
+            <w:tcW w:type="dxa" w:w="648"/>
+          </w:tcPr>
+          <w:p>
+            <w:pPr>
+              <w:pStyle w:val="tablecopy"/>
+              <w:keepNext/>
             </w:pPr>
             <w:r>
               <w:rPr>
@@ -2708,11 +2854,12 @@
         </w:tc>
         <w:tc>
           <w:tcPr>
-            <w:tcW w:type="dxa" w:w="1152"/>
-          </w:tcPr>
-          <w:p>
-            <w:pPr>
-              <w:pStyle w:val="tablecopy"/>
+            <w:tcW w:type="dxa" w:w="648"/>
+          </w:tcPr>
+          <w:p>
+            <w:pPr>
+              <w:pStyle w:val="tablecopy"/>
+              <w:keepNext/>
             </w:pPr>
             <w:r>
               <w:rPr>
@@ -2724,11 +2871,12 @@
         </w:tc>
         <w:tc>
           <w:tcPr>
-            <w:tcW w:type="dxa" w:w="1152"/>
-          </w:tcPr>
-          <w:p>
-            <w:pPr>
-              <w:pStyle w:val="tablecopy"/>
+            <w:tcW w:type="dxa" w:w="720"/>
+          </w:tcPr>
+          <w:p>
+            <w:pPr>
+              <w:pStyle w:val="tablecopy"/>
+              <w:keepNext/>
             </w:pPr>
             <w:r>
               <w:rPr>
@@ -2740,11 +2888,12 @@
         </w:tc>
         <w:tc>
           <w:tcPr>
-            <w:tcW w:type="dxa" w:w="1152"/>
-          </w:tcPr>
-          <w:p>
-            <w:pPr>
-              <w:pStyle w:val="tablecopy"/>
+            <w:tcW w:type="dxa" w:w="691"/>
+          </w:tcPr>
+          <w:p>
+            <w:pPr>
+              <w:pStyle w:val="tablecopy"/>
+              <w:keepNext/>
             </w:pPr>
             <w:r>
               <w:rPr>
@@ -2761,11 +2910,12 @@
         </w:trPr>
         <w:tc>
           <w:tcPr>
-            <w:tcW w:type="dxa" w:w="2088"/>
-          </w:tcPr>
-          <w:p>
-            <w:pPr>
-              <w:pStyle w:val="tablecopy"/>
+            <w:tcW w:type="dxa" w:w="1368"/>
+          </w:tcPr>
+          <w:p>
+            <w:pPr>
+              <w:pStyle w:val="tablecopy"/>
+              <w:keepNext/>
             </w:pPr>
             <w:r>
               <w:rPr>
@@ -2777,11 +2927,12 @@
         </w:tc>
         <w:tc>
           <w:tcPr>
-            <w:tcW w:type="dxa" w:w="1152"/>
-          </w:tcPr>
-          <w:p>
-            <w:pPr>
-              <w:pStyle w:val="tablecopy"/>
+            <w:tcW w:type="dxa" w:w="648"/>
+          </w:tcPr>
+          <w:p>
+            <w:pPr>
+              <w:pStyle w:val="tablecopy"/>
+              <w:keepNext/>
             </w:pPr>
             <w:r>
               <w:rPr>
@@ -2793,11 +2944,12 @@
         </w:tc>
         <w:tc>
           <w:tcPr>
-            <w:tcW w:type="dxa" w:w="1152"/>
-          </w:tcPr>
-          <w:p>
-            <w:pPr>
-              <w:pStyle w:val="tablecopy"/>
+            <w:tcW w:type="dxa" w:w="648"/>
+          </w:tcPr>
+          <w:p>
+            <w:pPr>
+              <w:pStyle w:val="tablecopy"/>
+              <w:keepNext/>
             </w:pPr>
             <w:r>
               <w:rPr>
@@ -2809,11 +2961,12 @@
         </w:tc>
         <w:tc>
           <w:tcPr>
-            <w:tcW w:type="dxa" w:w="1152"/>
-          </w:tcPr>
-          <w:p>
-            <w:pPr>
-              <w:pStyle w:val="tablecopy"/>
+            <w:tcW w:type="dxa" w:w="648"/>
+          </w:tcPr>
+          <w:p>
+            <w:pPr>
+              <w:pStyle w:val="tablecopy"/>
+              <w:keepNext/>
             </w:pPr>
             <w:r>
               <w:rPr>
@@ -2825,11 +2978,12 @@
         </w:tc>
         <w:tc>
           <w:tcPr>
-            <w:tcW w:type="dxa" w:w="1152"/>
-          </w:tcPr>
-          <w:p>
-            <w:pPr>
-              <w:pStyle w:val="tablecopy"/>
+            <w:tcW w:type="dxa" w:w="720"/>
+          </w:tcPr>
+          <w:p>
+            <w:pPr>
+              <w:pStyle w:val="tablecopy"/>
+              <w:keepNext/>
             </w:pPr>
             <w:r>
               <w:rPr>
@@ -2841,11 +2995,12 @@
         </w:tc>
         <w:tc>
           <w:tcPr>
-            <w:tcW w:type="dxa" w:w="1152"/>
-          </w:tcPr>
-          <w:p>
-            <w:pPr>
-              <w:pStyle w:val="tablecopy"/>
+            <w:tcW w:type="dxa" w:w="691"/>
+          </w:tcPr>
+          <w:p>
+            <w:pPr>
+              <w:pStyle w:val="tablecopy"/>
+              <w:keepNext/>
             </w:pPr>
             <w:r>
               <w:rPr>
@@ -2862,11 +3017,12 @@
         </w:trPr>
         <w:tc>
           <w:tcPr>
-            <w:tcW w:type="dxa" w:w="2088"/>
-          </w:tcPr>
-          <w:p>
-            <w:pPr>
-              <w:pStyle w:val="tablecopy"/>
+            <w:tcW w:type="dxa" w:w="1368"/>
+          </w:tcPr>
+          <w:p>
+            <w:pPr>
+              <w:pStyle w:val="tablecopy"/>
+              <w:keepNext/>
             </w:pPr>
             <w:r>
               <w:rPr>
@@ -2878,11 +3034,12 @@
         </w:tc>
         <w:tc>
           <w:tcPr>
-            <w:tcW w:type="dxa" w:w="1152"/>
-          </w:tcPr>
-          <w:p>
-            <w:pPr>
-              <w:pStyle w:val="tablecopy"/>
+            <w:tcW w:type="dxa" w:w="648"/>
+          </w:tcPr>
+          <w:p>
+            <w:pPr>
+              <w:pStyle w:val="tablecopy"/>
+              <w:keepNext/>
             </w:pPr>
             <w:r>
               <w:rPr>
@@ -2894,11 +3051,12 @@
         </w:tc>
         <w:tc>
           <w:tcPr>
-            <w:tcW w:type="dxa" w:w="1152"/>
-          </w:tcPr>
-          <w:p>
-            <w:pPr>
-              <w:pStyle w:val="tablecopy"/>
+            <w:tcW w:type="dxa" w:w="648"/>
+          </w:tcPr>
+          <w:p>
+            <w:pPr>
+              <w:pStyle w:val="tablecopy"/>
+              <w:keepNext/>
             </w:pPr>
             <w:r>
               <w:rPr>
@@ -2910,11 +3068,12 @@
         </w:tc>
         <w:tc>
           <w:tcPr>
-            <w:tcW w:type="dxa" w:w="1152"/>
-          </w:tcPr>
-          <w:p>
-            <w:pPr>
-              <w:pStyle w:val="tablecopy"/>
+            <w:tcW w:type="dxa" w:w="648"/>
+          </w:tcPr>
+          <w:p>
+            <w:pPr>
+              <w:pStyle w:val="tablecopy"/>
+              <w:keepNext/>
             </w:pPr>
             <w:r>
               <w:rPr>
@@ -2926,11 +3085,12 @@
         </w:tc>
         <w:tc>
           <w:tcPr>
-            <w:tcW w:type="dxa" w:w="1152"/>
-          </w:tcPr>
-          <w:p>
-            <w:pPr>
-              <w:pStyle w:val="tablecopy"/>
+            <w:tcW w:type="dxa" w:w="720"/>
+          </w:tcPr>
+          <w:p>
+            <w:pPr>
+              <w:pStyle w:val="tablecopy"/>
+              <w:keepNext/>
             </w:pPr>
             <w:r>
               <w:rPr>
@@ -2942,11 +3102,12 @@
         </w:tc>
         <w:tc>
           <w:tcPr>
-            <w:tcW w:type="dxa" w:w="1152"/>
-          </w:tcPr>
-          <w:p>
-            <w:pPr>
-              <w:pStyle w:val="tablecopy"/>
+            <w:tcW w:type="dxa" w:w="691"/>
+          </w:tcPr>
+          <w:p>
+            <w:pPr>
+              <w:pStyle w:val="tablecopy"/>
+              <w:keepNext/>
             </w:pPr>
             <w:r>
               <w:rPr>
@@ -2963,11 +3124,12 @@
         </w:trPr>
         <w:tc>
           <w:tcPr>
-            <w:tcW w:type="dxa" w:w="2088"/>
-          </w:tcPr>
-          <w:p>
-            <w:pPr>
-              <w:pStyle w:val="tablecopy"/>
+            <w:tcW w:type="dxa" w:w="1368"/>
+          </w:tcPr>
+          <w:p>
+            <w:pPr>
+              <w:pStyle w:val="tablecopy"/>
+              <w:keepNext/>
             </w:pPr>
             <w:r>
               <w:rPr>
@@ -2979,11 +3141,12 @@
         </w:tc>
         <w:tc>
           <w:tcPr>
-            <w:tcW w:type="dxa" w:w="1152"/>
-          </w:tcPr>
-          <w:p>
-            <w:pPr>
-              <w:pStyle w:val="tablecopy"/>
+            <w:tcW w:type="dxa" w:w="648"/>
+          </w:tcPr>
+          <w:p>
+            <w:pPr>
+              <w:pStyle w:val="tablecopy"/>
+              <w:keepNext/>
             </w:pPr>
             <w:r>
               <w:rPr>
@@ -2995,11 +3158,12 @@
         </w:tc>
         <w:tc>
           <w:tcPr>
-            <w:tcW w:type="dxa" w:w="1152"/>
-          </w:tcPr>
-          <w:p>
-            <w:pPr>
-              <w:pStyle w:val="tablecopy"/>
+            <w:tcW w:type="dxa" w:w="648"/>
+          </w:tcPr>
+          <w:p>
+            <w:pPr>
+              <w:pStyle w:val="tablecopy"/>
+              <w:keepNext/>
             </w:pPr>
             <w:r>
               <w:rPr>
@@ -3011,11 +3175,12 @@
         </w:tc>
         <w:tc>
           <w:tcPr>
-            <w:tcW w:type="dxa" w:w="1152"/>
-          </w:tcPr>
-          <w:p>
-            <w:pPr>
-              <w:pStyle w:val="tablecopy"/>
+            <w:tcW w:type="dxa" w:w="648"/>
+          </w:tcPr>
+          <w:p>
+            <w:pPr>
+              <w:pStyle w:val="tablecopy"/>
+              <w:keepNext/>
             </w:pPr>
             <w:r>
               <w:rPr>
@@ -3027,11 +3192,12 @@
         </w:tc>
         <w:tc>
           <w:tcPr>
-            <w:tcW w:type="dxa" w:w="1152"/>
-          </w:tcPr>
-          <w:p>
-            <w:pPr>
-              <w:pStyle w:val="tablecopy"/>
+            <w:tcW w:type="dxa" w:w="720"/>
+          </w:tcPr>
+          <w:p>
+            <w:pPr>
+              <w:pStyle w:val="tablecopy"/>
+              <w:keepNext/>
             </w:pPr>
             <w:r>
               <w:rPr>
@@ -3043,11 +3209,12 @@
         </w:tc>
         <w:tc>
           <w:tcPr>
-            <w:tcW w:type="dxa" w:w="1152"/>
-          </w:tcPr>
-          <w:p>
-            <w:pPr>
-              <w:pStyle w:val="tablecopy"/>
+            <w:tcW w:type="dxa" w:w="691"/>
+          </w:tcPr>
+          <w:p>
+            <w:pPr>
+              <w:pStyle w:val="tablecopy"/>
+              <w:keepNext/>
             </w:pPr>
             <w:r>
               <w:rPr>
@@ -3064,11 +3231,12 @@
         </w:trPr>
         <w:tc>
           <w:tcPr>
-            <w:tcW w:type="dxa" w:w="2088"/>
-          </w:tcPr>
-          <w:p>
-            <w:pPr>
-              <w:pStyle w:val="tablecopy"/>
+            <w:tcW w:type="dxa" w:w="1368"/>
+          </w:tcPr>
+          <w:p>
+            <w:pPr>
+              <w:pStyle w:val="tablecopy"/>
+              <w:keepNext/>
             </w:pPr>
             <w:r>
               <w:rPr>
@@ -3080,11 +3248,12 @@
         </w:tc>
         <w:tc>
           <w:tcPr>
-            <w:tcW w:type="dxa" w:w="1152"/>
-          </w:tcPr>
-          <w:p>
-            <w:pPr>
-              <w:pStyle w:val="tablecopy"/>
+            <w:tcW w:type="dxa" w:w="648"/>
+          </w:tcPr>
+          <w:p>
+            <w:pPr>
+              <w:pStyle w:val="tablecopy"/>
+              <w:keepNext/>
             </w:pPr>
             <w:r>
               <w:rPr>
@@ -3096,11 +3265,12 @@
         </w:tc>
         <w:tc>
           <w:tcPr>
-            <w:tcW w:type="dxa" w:w="1152"/>
-          </w:tcPr>
-          <w:p>
-            <w:pPr>
-              <w:pStyle w:val="tablecopy"/>
+            <w:tcW w:type="dxa" w:w="648"/>
+          </w:tcPr>
+          <w:p>
+            <w:pPr>
+              <w:pStyle w:val="tablecopy"/>
+              <w:keepNext/>
             </w:pPr>
             <w:r>
               <w:rPr>
@@ -3112,11 +3282,12 @@
         </w:tc>
         <w:tc>
           <w:tcPr>
-            <w:tcW w:type="dxa" w:w="1152"/>
-          </w:tcPr>
-          <w:p>
-            <w:pPr>
-              <w:pStyle w:val="tablecopy"/>
+            <w:tcW w:type="dxa" w:w="648"/>
+          </w:tcPr>
+          <w:p>
+            <w:pPr>
+              <w:pStyle w:val="tablecopy"/>
+              <w:keepNext/>
             </w:pPr>
             <w:r>
               <w:rPr>
@@ -3128,11 +3299,12 @@
         </w:tc>
         <w:tc>
           <w:tcPr>
-            <w:tcW w:type="dxa" w:w="1152"/>
-          </w:tcPr>
-          <w:p>
-            <w:pPr>
-              <w:pStyle w:val="tablecopy"/>
+            <w:tcW w:type="dxa" w:w="720"/>
+          </w:tcPr>
+          <w:p>
+            <w:pPr>
+              <w:pStyle w:val="tablecopy"/>
+              <w:keepNext/>
             </w:pPr>
             <w:r>
               <w:rPr>
@@ -3144,11 +3316,12 @@
         </w:tc>
         <w:tc>
           <w:tcPr>
-            <w:tcW w:type="dxa" w:w="1152"/>
-          </w:tcPr>
-          <w:p>
-            <w:pPr>
-              <w:pStyle w:val="tablecopy"/>
+            <w:tcW w:type="dxa" w:w="691"/>
+          </w:tcPr>
+          <w:p>
+            <w:pPr>
+              <w:pStyle w:val="tablecopy"/>
+              <w:keepNext/>
             </w:pPr>
             <w:r>
               <w:rPr>
@@ -3165,12 +3338,13 @@
         </w:trPr>
         <w:tc>
           <w:tcPr>
-            <w:tcW w:type="dxa" w:w="7848"/>
+            <w:tcW w:type="dxa" w:w="4723"/>
             <w:gridSpan w:val="6"/>
           </w:tcPr>
           <w:p>
             <w:pPr>
               <w:pStyle w:val="tablecopy"/>
+              <w:keepNext/>
             </w:pPr>
             <w:r>
               <w:rPr>
@@ -3187,11 +3361,12 @@
         </w:trPr>
         <w:tc>
           <w:tcPr>
-            <w:tcW w:type="dxa" w:w="2088"/>
-          </w:tcPr>
-          <w:p>
-            <w:pPr>
-              <w:pStyle w:val="tablecopy"/>
+            <w:tcW w:type="dxa" w:w="1368"/>
+          </w:tcPr>
+          <w:p>
+            <w:pPr>
+              <w:pStyle w:val="tablecopy"/>
+              <w:keepNext/>
             </w:pPr>
             <w:r>
               <w:rPr>
@@ -3203,11 +3378,12 @@
         </w:tc>
         <w:tc>
           <w:tcPr>
-            <w:tcW w:type="dxa" w:w="1152"/>
-          </w:tcPr>
-          <w:p>
-            <w:pPr>
-              <w:pStyle w:val="tablecopy"/>
+            <w:tcW w:type="dxa" w:w="648"/>
+          </w:tcPr>
+          <w:p>
+            <w:pPr>
+              <w:pStyle w:val="tablecopy"/>
+              <w:keepNext/>
             </w:pPr>
             <w:r>
               <w:rPr>
@@ -3219,11 +3395,12 @@
         </w:tc>
         <w:tc>
           <w:tcPr>
-            <w:tcW w:type="dxa" w:w="1152"/>
-          </w:tcPr>
-          <w:p>
-            <w:pPr>
-              <w:pStyle w:val="tablecopy"/>
+            <w:tcW w:type="dxa" w:w="648"/>
+          </w:tcPr>
+          <w:p>
+            <w:pPr>
+              <w:pStyle w:val="tablecopy"/>
+              <w:keepNext/>
             </w:pPr>
             <w:r>
               <w:rPr>
@@ -3235,11 +3412,12 @@
         </w:tc>
         <w:tc>
           <w:tcPr>
-            <w:tcW w:type="dxa" w:w="1152"/>
-          </w:tcPr>
-          <w:p>
-            <w:pPr>
-              <w:pStyle w:val="tablecopy"/>
+            <w:tcW w:type="dxa" w:w="648"/>
+          </w:tcPr>
+          <w:p>
+            <w:pPr>
+              <w:pStyle w:val="tablecopy"/>
+              <w:keepNext/>
             </w:pPr>
             <w:r>
               <w:rPr>
@@ -3251,11 +3429,12 @@
         </w:tc>
         <w:tc>
           <w:tcPr>
-            <w:tcW w:type="dxa" w:w="1152"/>
-          </w:tcPr>
-          <w:p>
-            <w:pPr>
-              <w:pStyle w:val="tablecopy"/>
+            <w:tcW w:type="dxa" w:w="720"/>
+          </w:tcPr>
+          <w:p>
+            <w:pPr>
+              <w:pStyle w:val="tablecopy"/>
+              <w:keepNext/>
             </w:pPr>
             <w:r>
               <w:rPr>
@@ -3267,11 +3446,12 @@
         </w:tc>
         <w:tc>
           <w:tcPr>
-            <w:tcW w:type="dxa" w:w="1152"/>
-          </w:tcPr>
-          <w:p>
-            <w:pPr>
-              <w:pStyle w:val="tablecopy"/>
+            <w:tcW w:type="dxa" w:w="691"/>
+          </w:tcPr>
+          <w:p>
+            <w:pPr>
+              <w:pStyle w:val="tablecopy"/>
+              <w:keepNext/>
             </w:pPr>
             <w:r>
               <w:rPr>
@@ -3288,11 +3468,12 @@
         </w:trPr>
         <w:tc>
           <w:tcPr>
-            <w:tcW w:type="dxa" w:w="2088"/>
-          </w:tcPr>
-          <w:p>
-            <w:pPr>
-              <w:pStyle w:val="tablecopy"/>
+            <w:tcW w:type="dxa" w:w="1368"/>
+          </w:tcPr>
+          <w:p>
+            <w:pPr>
+              <w:pStyle w:val="tablecopy"/>
+              <w:keepNext/>
             </w:pPr>
             <w:r>
               <w:rPr>
@@ -3304,11 +3485,12 @@
         </w:tc>
         <w:tc>
           <w:tcPr>
-            <w:tcW w:type="dxa" w:w="1152"/>
-          </w:tcPr>
-          <w:p>
-            <w:pPr>
-              <w:pStyle w:val="tablecopy"/>
+            <w:tcW w:type="dxa" w:w="648"/>
+          </w:tcPr>
+          <w:p>
+            <w:pPr>
+              <w:pStyle w:val="tablecopy"/>
+              <w:keepNext/>
             </w:pPr>
             <w:r>
               <w:rPr>
@@ -3320,11 +3502,12 @@
         </w:tc>
         <w:tc>
           <w:tcPr>
-            <w:tcW w:type="dxa" w:w="1152"/>
-          </w:tcPr>
-          <w:p>
-            <w:pPr>
-              <w:pStyle w:val="tablecopy"/>
+            <w:tcW w:type="dxa" w:w="648"/>
+          </w:tcPr>
+          <w:p>
+            <w:pPr>
+              <w:pStyle w:val="tablecopy"/>
+              <w:keepNext/>
             </w:pPr>
             <w:r>
               <w:rPr>
@@ -3336,11 +3519,12 @@
         </w:tc>
         <w:tc>
           <w:tcPr>
-            <w:tcW w:type="dxa" w:w="1152"/>
-          </w:tcPr>
-          <w:p>
-            <w:pPr>
-              <w:pStyle w:val="tablecopy"/>
+            <w:tcW w:type="dxa" w:w="648"/>
+          </w:tcPr>
+          <w:p>
+            <w:pPr>
+              <w:pStyle w:val="tablecopy"/>
+              <w:keepNext/>
             </w:pPr>
             <w:r>
               <w:rPr>
@@ -3352,11 +3536,12 @@
         </w:tc>
         <w:tc>
           <w:tcPr>
-            <w:tcW w:type="dxa" w:w="1152"/>
-          </w:tcPr>
-          <w:p>
-            <w:pPr>
-              <w:pStyle w:val="tablecopy"/>
+            <w:tcW w:type="dxa" w:w="720"/>
+          </w:tcPr>
+          <w:p>
+            <w:pPr>
+              <w:pStyle w:val="tablecopy"/>
+              <w:keepNext/>
             </w:pPr>
             <w:r>
               <w:rPr>
@@ -3368,11 +3553,12 @@
         </w:tc>
         <w:tc>
           <w:tcPr>
-            <w:tcW w:type="dxa" w:w="1152"/>
-          </w:tcPr>
-          <w:p>
-            <w:pPr>
-              <w:pStyle w:val="tablecopy"/>
+            <w:tcW w:type="dxa" w:w="691"/>
+          </w:tcPr>
+          <w:p>
+            <w:pPr>
+              <w:pStyle w:val="tablecopy"/>
+              <w:keepNext/>
             </w:pPr>
             <w:r>
               <w:rPr>
@@ -3389,11 +3575,12 @@
         </w:trPr>
         <w:tc>
           <w:tcPr>
-            <w:tcW w:type="dxa" w:w="2088"/>
-          </w:tcPr>
-          <w:p>
-            <w:pPr>
-              <w:pStyle w:val="tablecopy"/>
+            <w:tcW w:type="dxa" w:w="1368"/>
+          </w:tcPr>
+          <w:p>
+            <w:pPr>
+              <w:pStyle w:val="tablecopy"/>
+              <w:keepNext/>
             </w:pPr>
             <w:r>
               <w:rPr>
@@ -3405,11 +3592,12 @@
         </w:tc>
         <w:tc>
           <w:tcPr>
-            <w:tcW w:type="dxa" w:w="1152"/>
-          </w:tcPr>
-          <w:p>
-            <w:pPr>
-              <w:pStyle w:val="tablecopy"/>
+            <w:tcW w:type="dxa" w:w="648"/>
+          </w:tcPr>
+          <w:p>
+            <w:pPr>
+              <w:pStyle w:val="tablecopy"/>
+              <w:keepNext/>
             </w:pPr>
             <w:r>
               <w:rPr>
@@ -3421,11 +3609,12 @@
         </w:tc>
         <w:tc>
           <w:tcPr>
-            <w:tcW w:type="dxa" w:w="1152"/>
-          </w:tcPr>
-          <w:p>
-            <w:pPr>
-              <w:pStyle w:val="tablecopy"/>
+            <w:tcW w:type="dxa" w:w="648"/>
+          </w:tcPr>
+          <w:p>
+            <w:pPr>
+              <w:pStyle w:val="tablecopy"/>
+              <w:keepNext/>
             </w:pPr>
             <w:r>
               <w:rPr>
@@ -3437,11 +3626,12 @@
         </w:tc>
         <w:tc>
           <w:tcPr>
-            <w:tcW w:type="dxa" w:w="1152"/>
-          </w:tcPr>
-          <w:p>
-            <w:pPr>
-              <w:pStyle w:val="tablecopy"/>
+            <w:tcW w:type="dxa" w:w="648"/>
+          </w:tcPr>
+          <w:p>
+            <w:pPr>
+              <w:pStyle w:val="tablecopy"/>
+              <w:keepNext/>
             </w:pPr>
             <w:r>
               <w:rPr>
@@ -3453,11 +3643,12 @@
         </w:tc>
         <w:tc>
           <w:tcPr>
-            <w:tcW w:type="dxa" w:w="1152"/>
-          </w:tcPr>
-          <w:p>
-            <w:pPr>
-              <w:pStyle w:val="tablecopy"/>
+            <w:tcW w:type="dxa" w:w="720"/>
+          </w:tcPr>
+          <w:p>
+            <w:pPr>
+              <w:pStyle w:val="tablecopy"/>
+              <w:keepNext/>
             </w:pPr>
             <w:r>
               <w:rPr>
@@ -3469,11 +3660,12 @@
         </w:tc>
         <w:tc>
           <w:tcPr>
-            <w:tcW w:type="dxa" w:w="1152"/>
-          </w:tcPr>
-          <w:p>
-            <w:pPr>
-              <w:pStyle w:val="tablecopy"/>
+            <w:tcW w:type="dxa" w:w="691"/>
+          </w:tcPr>
+          <w:p>
+            <w:pPr>
+              <w:pStyle w:val="tablecopy"/>
+              <w:keepNext/>
             </w:pPr>
             <w:r>
               <w:rPr>
@@ -3490,11 +3682,12 @@
         </w:trPr>
         <w:tc>
           <w:tcPr>
-            <w:tcW w:type="dxa" w:w="2088"/>
-          </w:tcPr>
-          <w:p>
-            <w:pPr>
-              <w:pStyle w:val="tablecopy"/>
+            <w:tcW w:type="dxa" w:w="1368"/>
+          </w:tcPr>
+          <w:p>
+            <w:pPr>
+              <w:pStyle w:val="tablecopy"/>
+              <w:keepNext/>
             </w:pPr>
             <w:r>
               <w:rPr>
@@ -3506,11 +3699,12 @@
         </w:tc>
         <w:tc>
           <w:tcPr>
-            <w:tcW w:type="dxa" w:w="1152"/>
-          </w:tcPr>
-          <w:p>
-            <w:pPr>
-              <w:pStyle w:val="tablecopy"/>
+            <w:tcW w:type="dxa" w:w="648"/>
+          </w:tcPr>
+          <w:p>
+            <w:pPr>
+              <w:pStyle w:val="tablecopy"/>
+              <w:keepNext/>
             </w:pPr>
             <w:r>
               <w:rPr>
@@ -3522,11 +3716,12 @@
         </w:tc>
         <w:tc>
           <w:tcPr>
-            <w:tcW w:type="dxa" w:w="1152"/>
-          </w:tcPr>
-          <w:p>
-            <w:pPr>
-              <w:pStyle w:val="tablecopy"/>
+            <w:tcW w:type="dxa" w:w="648"/>
+          </w:tcPr>
+          <w:p>
+            <w:pPr>
+              <w:pStyle w:val="tablecopy"/>
+              <w:keepNext/>
             </w:pPr>
             <w:r>
               <w:rPr>
@@ -3538,11 +3733,12 @@
         </w:tc>
         <w:tc>
           <w:tcPr>
-            <w:tcW w:type="dxa" w:w="1152"/>
-          </w:tcPr>
-          <w:p>
-            <w:pPr>
-              <w:pStyle w:val="tablecopy"/>
+            <w:tcW w:type="dxa" w:w="648"/>
+          </w:tcPr>
+          <w:p>
+            <w:pPr>
+              <w:pStyle w:val="tablecopy"/>
+              <w:keepNext/>
             </w:pPr>
             <w:r>
               <w:rPr>
@@ -3554,11 +3750,12 @@
         </w:tc>
         <w:tc>
           <w:tcPr>
-            <w:tcW w:type="dxa" w:w="1152"/>
-          </w:tcPr>
-          <w:p>
-            <w:pPr>
-              <w:pStyle w:val="tablecopy"/>
+            <w:tcW w:type="dxa" w:w="720"/>
+          </w:tcPr>
+          <w:p>
+            <w:pPr>
+              <w:pStyle w:val="tablecopy"/>
+              <w:keepNext/>
             </w:pPr>
             <w:r>
               <w:rPr>
@@ -3570,11 +3767,12 @@
         </w:tc>
         <w:tc>
           <w:tcPr>
-            <w:tcW w:type="dxa" w:w="1152"/>
-          </w:tcPr>
-          <w:p>
-            <w:pPr>
-              <w:pStyle w:val="tablecopy"/>
+            <w:tcW w:type="dxa" w:w="691"/>
+          </w:tcPr>
+          <w:p>
+            <w:pPr>
+              <w:pStyle w:val="tablecopy"/>
+              <w:keepNext/>
             </w:pPr>
             <w:r>
               <w:rPr>
@@ -3591,11 +3789,12 @@
         </w:trPr>
         <w:tc>
           <w:tcPr>
-            <w:tcW w:type="dxa" w:w="2088"/>
-          </w:tcPr>
-          <w:p>
-            <w:pPr>
-              <w:pStyle w:val="tablecopy"/>
+            <w:tcW w:type="dxa" w:w="1368"/>
+          </w:tcPr>
+          <w:p>
+            <w:pPr>
+              <w:pStyle w:val="tablecopy"/>
+              <w:keepNext/>
             </w:pPr>
             <w:r>
               <w:rPr>
@@ -3607,11 +3806,12 @@
         </w:tc>
         <w:tc>
           <w:tcPr>
-            <w:tcW w:type="dxa" w:w="1152"/>
-          </w:tcPr>
-          <w:p>
-            <w:pPr>
-              <w:pStyle w:val="tablecopy"/>
+            <w:tcW w:type="dxa" w:w="648"/>
+          </w:tcPr>
+          <w:p>
+            <w:pPr>
+              <w:pStyle w:val="tablecopy"/>
+              <w:keepNext/>
             </w:pPr>
             <w:r>
               <w:rPr>
@@ -3623,11 +3823,12 @@
         </w:tc>
         <w:tc>
           <w:tcPr>
-            <w:tcW w:type="dxa" w:w="1152"/>
-          </w:tcPr>
-          <w:p>
-            <w:pPr>
-              <w:pStyle w:val="tablecopy"/>
+            <w:tcW w:type="dxa" w:w="648"/>
+          </w:tcPr>
+          <w:p>
+            <w:pPr>
+              <w:pStyle w:val="tablecopy"/>
+              <w:keepNext/>
             </w:pPr>
             <w:r>
               <w:rPr>
@@ -3639,11 +3840,12 @@
         </w:tc>
         <w:tc>
           <w:tcPr>
-            <w:tcW w:type="dxa" w:w="1152"/>
-          </w:tcPr>
-          <w:p>
-            <w:pPr>
-              <w:pStyle w:val="tablecopy"/>
+            <w:tcW w:type="dxa" w:w="648"/>
+          </w:tcPr>
+          <w:p>
+            <w:pPr>
+              <w:pStyle w:val="tablecopy"/>
+              <w:keepNext/>
             </w:pPr>
             <w:r>
               <w:rPr>
@@ -3655,11 +3857,12 @@
         </w:tc>
         <w:tc>
           <w:tcPr>
-            <w:tcW w:type="dxa" w:w="1152"/>
-          </w:tcPr>
-          <w:p>
-            <w:pPr>
-              <w:pStyle w:val="tablecopy"/>
+            <w:tcW w:type="dxa" w:w="720"/>
+          </w:tcPr>
+          <w:p>
+            <w:pPr>
+              <w:pStyle w:val="tablecopy"/>
+              <w:keepNext/>
             </w:pPr>
             <w:r>
               <w:rPr>
@@ -3671,11 +3874,12 @@
         </w:tc>
         <w:tc>
           <w:tcPr>
-            <w:tcW w:type="dxa" w:w="1152"/>
-          </w:tcPr>
-          <w:p>
-            <w:pPr>
-              <w:pStyle w:val="tablecopy"/>
+            <w:tcW w:type="dxa" w:w="691"/>
+          </w:tcPr>
+          <w:p>
+            <w:pPr>
+              <w:pStyle w:val="tablecopy"/>
+              <w:keepNext/>
             </w:pPr>
             <w:r>
               <w:rPr>
@@ -3692,7 +3896,7 @@
         </w:trPr>
         <w:tc>
           <w:tcPr>
-            <w:tcW w:type="dxa" w:w="2088"/>
+            <w:tcW w:type="dxa" w:w="1368"/>
           </w:tcPr>
           <w:p>
             <w:pPr>
@@ -3708,7 +3912,7 @@
         </w:tc>
         <w:tc>
           <w:tcPr>
-            <w:tcW w:type="dxa" w:w="1152"/>
+            <w:tcW w:type="dxa" w:w="648"/>
           </w:tcPr>
           <w:p>
             <w:pPr>
@@ -3724,7 +3928,7 @@
         </w:tc>
         <w:tc>
           <w:tcPr>
-            <w:tcW w:type="dxa" w:w="1152"/>
+            <w:tcW w:type="dxa" w:w="648"/>
           </w:tcPr>
           <w:p>
             <w:pPr>
@@ -3740,7 +3944,7 @@
         </w:tc>
         <w:tc>
           <w:tcPr>
-            <w:tcW w:type="dxa" w:w="1152"/>
+            <w:tcW w:type="dxa" w:w="648"/>
           </w:tcPr>
           <w:p>
             <w:pPr>
@@ -3756,7 +3960,7 @@
         </w:tc>
         <w:tc>
           <w:tcPr>
-            <w:tcW w:type="dxa" w:w="1152"/>
+            <w:tcW w:type="dxa" w:w="720"/>
           </w:tcPr>
           <w:p>
             <w:pPr>
@@ -3772,7 +3976,7 @@
         </w:tc>
         <w:tc>
           <w:tcPr>
-            <w:tcW w:type="dxa" w:w="1152"/>
+            <w:tcW w:type="dxa" w:w="691"/>
           </w:tcPr>
           <w:p>
             <w:pPr>
@@ -3817,7 +4021,7 @@
       <w:r>
         <w:drawing>
           <wp:inline xmlns:a="http://schemas.openxmlformats.org/drawingml/2006/main" xmlns:pic="http://schemas.openxmlformats.org/drawingml/2006/picture">
-            <wp:extent cx="3840480" cy="2743200"/>
+            <wp:extent cx="2880360" cy="2057400"/>
             <wp:docPr id="1" name="Picture 1"/>
             <wp:cNvGraphicFramePr>
               <a:graphicFrameLocks noChangeAspect="1"/>
@@ -3838,7 +4042,7 @@
                   <pic:spPr>
                     <a:xfrm>
                       <a:off x="0" y="0"/>
-                      <a:ext cx="3840480" cy="2743200"/>
+                      <a:ext cx="2880360" cy="2057400"/>
                     </a:xfrm>
                     <a:prstGeom prst="rect"/>
                   </pic:spPr>
@@ -4182,8 +4386,8 @@
     <w:sectPr>
       <w:type w:val="continuous"/>
       <w:pgSz w:w="595.30pt" w:h="841.90pt" w:code="9"/>
-      <w:pgMar w:top="54pt" w:right="44.65pt" w:bottom="72pt" w:left="44.65pt" w:header="36pt" w:footer="36pt" w:gutter="0pt"/>
-      <w:cols w:space="36pt"/>
+      <w:pgMar w:top="54pt" w:right="1080" w:bottom="72pt" w:left="1080" w:header="36pt" w:footer="36pt" w:gutter="0pt"/>
+      <w:cols w:space="288" w:num="2" w:equalWidth="1"/>
       <w:docGrid w:linePitch="360"/>
     </w:sectPr>
   </w:body>

</xml_diff>

<commit_message>
Citation hygiene and public code release
- bibliography renumbered so reference numbers follow first appearance (16 entries)
- every reference is cited; no uncited entries and no self-citation
- related work cited in grouped brackets instead of repeated single citations
- the repository is no longer a reference entry: the public URL
  https://github.com/Aldrin7/brfss-diabetes-screening-iccica2027 is written directly into the
  Data and Code Availability statement
- repository pushed to GitHub and made public; the anonymized build withholds the URL
</commit_message>
<xml_diff>
--- a/manuscript/manuscript.docx
+++ b/manuscript/manuscript.docx
@@ -143,7 +143,7 @@
         <w:rPr>
           <w:b w:val="0"/>
         </w:rPr>
-        <w:t xml:space="preserve"> Prior work has applied logistic regression and machine learning classifiers to the BRFSS, with AUC values roughly between 0.72 and 0.80 [2], and has extended to NHANES dysglycemia screening with decision-curve analysis [6], to external validation of NHANES-trained models on BRFSS with a 9.7% relative AUC drop [7], and to feature selection on BRFSS at AUC 0.823 [8]. Widely used claims about survey-based diabetes models are not reproducible under a leakage-audited protocol: on this same 253,680-row dataset, published pipelines report AUC near 0.99 [7], whereas we measure 0.827. We therefore audit rather than chase AUC, and three findings are negative results that change practice: class-balancing weights are unnecessary and costly, attribute-specific thresholds do not transfer out of time, and the age disparity is not a threshold artifact.</w:t>
+        <w:t xml:space="preserve"> Prior work has applied logistic regression and machine learning classifiers to the BRFSS, with AUC values roughly between 0.72 and 0.80, and has extended to NHANES dysglycemia screening with decision-curve analysis, to external validation of NHANES-trained models on BRFSS with a 9.7% relative AUC drop, and to feature selection on BRFSS at AUC 0.823 [1]-[4]. Widely used claims about survey-based diabetes models are not reproducible under a leakage-audited protocol: on this same 253,680-row dataset, published pipelines report AUC near 0.99, whereas we measure 0.827. We therefore audit rather than chase AUC, and three findings are negative results that change practice: class-balancing weights are unnecessary and costly, attribute-specific thresholds do not transfer out of time, and the age disparity is not a threshold artifact.</w:t>
       </w:r>
     </w:p>
     <w:p>
@@ -229,7 +229,7 @@
         <w:rPr>
           <w:b w:val="0"/>
         </w:rPr>
-        <w:t>We use the CDC Diabetes Health Indicators dataset [1], derived from the 2015 BRFSS, a telephone survey conducted annually by the CDC since 1984. The cleaned release contains 253,680 listwise-complete respondents and 21 features, under CC0. The target is Diabetes_binary (0 = no diabetes, 1 = prediabetes or diabetes; prevalence 13.93%). Three features of the release constrain our claims. Race/ethnicity is absent, so fairness analysis is limited to sex, age, income, and education. The release carries no survey design variables (weights, strata, PSUs), so population-level claims are not supported and we quantify only the sensitivity of our uncertainty to assumed design effects. Finally, it collapses prediabetes and diabetes, addressed here with severity-stratified analysis. The 21 features span five groups: clinical, lifestyle, access, mental and physical status, and demographic (the full list is in the released code). Several are proxies—general health stands in for clinical status, income and education for socioeconomic position—and we treat them as such. No row was removed: a stratified 80/20 split (seed 42) yields 202,944 train and 50,736 test cases, with a further 64/16/20 train/calibration/test split for calibration work, and all preprocessing is fit on the training portion only.</w:t>
+        <w:t>We use the CDC Diabetes Health Indicators dataset [5], derived from the 2015 BRFSS, a telephone survey conducted annually by the CDC since 1984. The cleaned release contains 253,680 listwise-complete respondents and 21 features, under CC0. The target is Diabetes_binary (0 = no diabetes, 1 = prediabetes or diabetes; prevalence 13.93%). Three features of the release constrain our claims. Race/ethnicity is absent, so fairness analysis is limited to sex, age, income, and education. The release carries no survey design variables (weights, strata, PSUs), so population-level claims are not supported and we quantify only the sensitivity of our uncertainty to assumed design effects. Finally, it collapses prediabetes and diabetes, addressed here with severity-stratified analysis. The 21 features span five groups: clinical, lifestyle, access, mental and physical status, and demographic (the full list is in the released code). Several are proxies—general health stands in for clinical status, income and education for socioeconomic position—and we treat them as such. No row was removed: a stratified 80/20 split (seed 42) yields 202,944 train and 50,736 test cases, with a further 64/16/20 train/calibration/test split for calibration work, and all preprocessing is fit on the training portion only.</w:t>
       </w:r>
     </w:p>
     <w:p>
@@ -251,7 +251,7 @@
         <w:rPr>
           <w:b w:val="0"/>
         </w:rPr>
-        <w:t>Three models: (M0) logistic regression with L2 penalty (interpretable baseline), (M1) random forest (50–100 trees, max depth 20), (M2) scikit-learn's histogram-based gradient boosting (150 iterations, 31 leaves). The humble-baseline move: logistic regression is included deliberately and reported honestly. Because class-balancing weights distort the probability scale, we also train an unweighted gradient-boosting variant. Features are used as provided; continuous-valued fields are standardized for logistic regression only, and no derived features are added, keeping the questionnaire short. Model development uses stratified 5-fold cross-validation on the training portion and a held-out test set, with variance over five independent seeds (full re-split and re-train) as mean ± std. Baseline settings are fixed and light; to verify that these do not disadvantage any baseline we run a randomized search (20 iterations for gradient boosting, 6 for random forest, 10 for logistic regression; 3-fold CV on the training portion only) and tune XGBoost [12] (12 iterations, 3-fold CV).</w:t>
+        <w:t>Three models: (M0) logistic regression with L2 penalty (interpretable baseline), (M1) random forest (50–100 trees, max depth 20), (M2) scikit-learn's histogram-based gradient boosting (150 iterations, 31 leaves). The humble-baseline move: logistic regression is included deliberately and reported honestly. Because class-balancing weights distort the probability scale, we also train an unweighted gradient-boosting variant. Features are used as provided; continuous-valued fields are standardized for logistic regression only, and no derived features are added, keeping the questionnaire short. Model development uses stratified 5-fold cross-validation on the training portion and a held-out test set, with variance over five independent seeds (full re-split and re-train) as mean ± std. Baseline settings are fixed and light; to verify that these do not disadvantage any baseline we run a randomized search (20 iterations for gradient boosting, 6 for random forest, 10 for logistic regression; 3-fold CV on the training portion only) and tune XGBoost [6] (12 iterations, 3-fold CV).</w:t>
       </w:r>
     </w:p>
     <w:p>
@@ -273,7 +273,7 @@
         <w:rPr>
           <w:b w:val="0"/>
         </w:rPr>
-        <w:t>We keep the threshold convention explicit, because fairness at a conventional cutoff and at a deployed operating point differ\. Unless stated otherwise, subgroup fairness (Table 3) and the support-restricted age analysis use the conventional 0.5 cutoff on raw scores; all operating-point results (Table 4) use recalibrated scores at a sensitivity-targeted threshold; and the per-wave thresholds are chosen on raw scores to hold 85% sensitivity, with ECE reported on calibrated scores. Discrimination is measured by ROC-AUC, average precision (AUPRC), F1, and accuracy; calibration by Brier score, expected calibration error (ECE), and maximum calibration error (MCE), overall and per group, before and after recalibration with isotonic, Platt, Beta, and Venn–Abers calibrators, with ECE under five binning schemes. Leakage control uses three held-out protocols—a plain stratified split, a deduplicated test set, and grouped held-out assignment with identical covariate vectors confined to one fold—plus a deduplicated refit and a label-noise refit. Fairness uses TPR gap, FPR gap, equalized-odds difference [4], and selection-rate gap, each with per-group supports, 300-resample bootstrap confidence intervals, design-effect sensitivity, and intersectional cells. Model comparison uses a paired bootstrap of the test-set AUC difference (2,000 resamples); utility uses decision-curve net benefit. TreeSHAP [3] is computed on a 2,000-row test sample, with mean absolute SHAP per feature, top-10 stability as mean pairwise Jaccard overlap across seeds and waves, and comparison with permutation importance; as a complementary view we count single-feature counterfactual flips near the decision threshold, since SHAP is an attribution method and not a causal explanation [13]. Bounded perturbation probes shift each modifiable feature to a specified value, clipped to its historical range, and report the induced change in predicted probability with a paired bootstrap interval; these characterise behaviour, not causal effects. Implementation is Python 3.11.8, scikit-learn 1.5.2, XGBoost 2.1.3, SHAP 0.46.0, pandas 2.2.3, NumPy 2.1.3, matplotlib 3.9.2; seeds are fixed (42, 7, 123, 2024, 99), and run manifests and a SHA-256 artifact manifest are released with the code [17].</w:t>
+        <w:t>We keep the threshold convention explicit, because fairness at a conventional cutoff and at a deployed operating point differ\. Unless stated otherwise, subgroup fairness (Table 3) and the support-restricted age analysis use the conventional 0.5 cutoff on raw scores; all operating-point results (Table 4) use recalibrated scores at a sensitivity-targeted threshold; and the per-wave thresholds are chosen on raw scores to hold 85% sensitivity, with ECE reported on calibrated scores. Discrimination is measured by ROC-AUC, average precision (AUPRC), F1, and accuracy; calibration by Brier score, expected calibration error (ECE), and maximum calibration error (MCE), overall and per group, before and after recalibration with isotonic, Platt, Beta, and Venn–Abers calibrators, with ECE under five binning schemes. Leakage control uses three held-out protocols—a plain stratified split, a deduplicated test set, and grouped held-out assignment with identical covariate vectors confined to one fold—plus a deduplicated refit and a label-noise refit. Fairness uses TPR gap, FPR gap, equalized-odds difference [7], and selection-rate gap, each with per-group supports, 300-resample bootstrap confidence intervals, design-effect sensitivity, and intersectional cells. Model comparison uses a paired bootstrap of the test-set AUC difference (2,000 resamples); utility uses decision-curve net benefit. TreeSHAP [8] is computed on a 2,000-row test sample, with mean absolute SHAP per feature, top-10 stability as mean pairwise Jaccard overlap across seeds and waves, and comparison with permutation importance; as a complementary view we count single-feature counterfactual flips near the decision threshold, since SHAP is an attribution method and not a causal explanation [9]. Bounded perturbation probes shift each modifiable feature to a specified value, clipped to its historical range, and report the induced change in predicted probability with a paired bootstrap interval; these characterise behaviour, not causal effects. Implementation is Python 3.11.8, scikit-learn 1.5.2, XGBoost 2.1.3, SHAP 0.46.0, pandas 2.2.3, NumPy 2.1.3, matplotlib 3.9.2; seeds are fixed (42, 7, 123, 2024, 99), and run manifests and a SHA-256 artifact manifest are released with the code (repository in the Data and Code Availability section).</w:t>
       </w:r>
     </w:p>
     <w:p>
@@ -1749,7 +1749,7 @@
         <w:rPr>
           <w:b w:val="0"/>
         </w:rPr>
-        <w:t>Training on the 2015 wave and testing on later waves yields AUC 0.8338 (2017, n = 275,854), 0.8256 (2019, n = 243,317), and 0.8198 (2021, n = 236,378), against prevalences of 0.141, 0.145, and 0.142: a mild downward trend. The 2015 calibration map can also be transported rather than refit per wave, since refitting is impossible in a prospective deployment: the 2015-fitted isotonic map gives ECE 0.0064, 0.0062, and 0.0097 against raw values of 0.2240, 0.2326, and 0.2236; refitting on each wave improves ECE by only 0.0035, 0.0030, and 0.0056 (Brier penalties below 0.002), so the transport penalty is small. The threshold holding 85% sensitivity moves only from 0.420 to 0.395 across waves, so the operating point needs no per-wave re-estimation. The 0.014 AUC drop from 2017 to 2021 is milder than the 9.7% relative drop reported when an NHANES-trained model was validated on BRFSS [7].</w:t>
+        <w:t>Training on the 2015 wave and testing on later waves yields AUC 0.8338 (2017, n = 275,854), 0.8256 (2019, n = 243,317), and 0.8198 (2021, n = 236,378), against prevalences of 0.141, 0.145, and 0.142: a mild downward trend. The 2015 calibration map can also be transported rather than refit per wave, since refitting is impossible in a prospective deployment: the 2015-fitted isotonic map gives ECE 0.0064, 0.0062, and 0.0097 against raw values of 0.2240, 0.2326, and 0.2236; refitting on each wave improves ECE by only 0.0035, 0.0030, and 0.0056 (Brier penalties below 0.002), so the transport penalty is small. The threshold holding 85% sensitivity moves only from 0.420 to 0.395 across waves, so the operating point needs no per-wave re-estimation. The 0.014 AUC drop from 2017 to 2021 is milder than the 9.7% relative drop reported when an NHANES-trained model was validated on BRFSS [3].</w:t>
       </w:r>
     </w:p>
     <w:p>
@@ -1771,7 +1771,7 @@
         <w:rPr>
           <w:b w:val="0"/>
         </w:rPr>
-        <w:t>We quantify subgroup disparities with per-group supports and bootstrap confidence intervals (300 resamples) rather than point estimates alone, following recent audit practice for clinical risk models [10]. Table 3 reports the TPR gap, the equalized-odds FPR gap, and the smallest group count; we caution against over-interpreting gap metrics without base-rate context [5]. The sex TPR gap is small (0.0241, 95% CI [0.0066, 0.0417]); the age TPR gap is very large (0.7889, CI [0.6421, 0.8774]), but the smallest age band contains only 14 positives. Without design variables we cannot estimate the true design effect, so we report how the uncertainty would widen: the widest TPR-gap interval grows from 0.235 at DEFF =1 to 0.407 at DEFF =3, leaving conclusions unchanged but indicating that our intervals are optimistic. \1 Within age bands, discrimination is uneven rather than absent: over the seven support-retained bands, band-level AUC ranges from 0.7030 to 0.8245 in 2015 and 0.7065 to 0.8064 in 2021, with per-band ECE at most 0.0208 and 0.0246, so the age gap is not a calibration failure; net benefit at the recommended threshold stays positive in every band from 50–54 upward in 2021 (0.0692–0.1556).</w:t>
+        <w:t>We quantify subgroup disparities with per-group supports and bootstrap confidence intervals (300 resamples) rather than point estimates alone, following recent audit practice for clinical risk models [10]. Table 3 reports the TPR gap, the equalized-odds FPR gap, and the smallest group count; we caution against over-interpreting gap metrics without base-rate context [11]. The sex TPR gap is small (0.0241, 95% CI [0.0066, 0.0417]); the age TPR gap is very large (0.7889, CI [0.6421, 0.8774]), but the smallest age band contains only 14 positives. Without design variables we cannot estimate the true design effect, so we report how the uncertainty would widen: the widest TPR-gap interval grows from 0.235 at DEFF =1 to 0.407 at DEFF =3, leaving conclusions unchanged but indicating that our intervals are optimistic. \1 Within age bands, discrimination is uneven rather than absent: over the seven support-retained bands, band-level AUC ranges from 0.7030 to 0.8245 in 2015 and 0.7065 to 0.8064 in 2021, with per-band ECE at most 0.0208 and 0.0246, so the age gap is not a calibration failure; net benefit at the recommended threshold stays positive in every band from 50–54 upward in 2021 (0.0692–0.1556).</w:t>
       </w:r>
     </w:p>
     <w:p>
@@ -4011,7 +4011,7 @@
         <w:rPr>
           <w:b w:val="0"/>
         </w:rPr>
-        <w:t>SHAP (Fig. 1) ranks general health status (0.638), high blood pressure (0.541), age (0.416), BMI (0.382), and high cholesterol (0.313) as the leading contributors, with the remaining features between income (0.136) and education (0.045). These align with established risk factors and support face validity, although several are consequences rather than antecedents of diabetes. The top-10 ordering is stable: mean pairwise Jaccard overlap is 0.964 across the five seeds (minimum 0.818, differing only in the tenth position) and 0.818 between 2015 and each later wave, where heavy alcohol use replaces difficulty walking; the ranking is a property of the data period, not the seed. As a complementary check on SHAP's known limitations [13], we compared the SHAP ranking with permutation importance (five repeats, ROC-AUC scoring): the two agree closely (Spearman rank correlation 0.955; 9 of the top 10 features in common), differing only in the order of BMI and age. Single-feature counterfactual flips among the 4,408 individuals within 0.05 of the threshold show that a one-point change in general health flips 67.5% of them, a ±5 change in BMI flips 88.2%, and a one-point change in age flips 48.0%, whereas changes in high blood pressure or high cholesterol flip none. The contrast between the SHAP ranking and the flip behaviour of binary features cautions against reading SHAP values as clinical leverage.</w:t>
+        <w:t>SHAP (Fig. 1) ranks general health status (0.638), high blood pressure (0.541), age (0.416), BMI (0.382), and high cholesterol (0.313) as the leading contributors, with the remaining features between income (0.136) and education (0.045). These align with established risk factors and support face validity, although several are consequences rather than antecedents of diabetes. The top-10 ordering is stable: mean pairwise Jaccard overlap is 0.964 across the five seeds (minimum 0.818, differing only in the tenth position) and 0.818 between 2015 and each later wave, where heavy alcohol use replaces difficulty walking; the ranking is a property of the data period, not the seed. As a complementary check on the known limitations of attribution methods, we compared the SHAP ranking with permutation importance (five repeats, ROC-AUC scoring): the two agree closely (Spearman rank correlation 0.955; 9 of the top 10 features in common), differing only in the order of BMI and age. Single-feature counterfactual flips among the 4,408 individuals within 0.05 of the threshold show that a one-point change in general health flips 67.5% of them, a ±5 change in BMI flips 88.2%, and a one-point change in age flips 48.0%, whereas changes in high blood pressure or high cholesterol flip none. The contrast between the SHAP ranking and the flip behaviour of binary features cautions against reading SHAP values as clinical leverage.</w:t>
       </w:r>
     </w:p>
     <w:p>
@@ -4072,7 +4072,7 @@
         <w:rPr>
           <w:b w:val="0"/>
         </w:rPr>
-        <w:t>Feature-group ablations show that clinical-history features carry most of the signal (AUC 0.8241 versus 0.7104 for demographics alone), while lifestyle features alone are weaker (0.7475). Using training-only SHAP rankings, five features retain AUC 0.8186 against 0.8269 for all 21, and eleven reach 0.8257. At k=10, SHAP attains 0.8248, correlation filtering 0.8218, mutual information 0.8213, and ten random features 0.7784 ± 0.0108—SHAP is strongest but only marginally over the other filters, consistent with the 0.823 reported for a copula filter on this dataset [8]. Because several top features proxy the same constructs, we do not claim that a ten-item form is clinically validated.</w:t>
+        <w:t>Feature-group ablations show that clinical-history features carry most of the signal (AUC 0.8241 versus 0.7104 for demographics alone), while lifestyle features alone are weaker (0.7475). Using training-only SHAP rankings, five features retain AUC 0.8186 against 0.8269 for all 21, and eleven reach 0.8257. At k=10, SHAP attains 0.8248, correlation filtering 0.8218, mutual information 0.8213, and ten random features 0.7784 ± 0.0108—SHAP is strongest but only marginally over the other filters, consistent with the 0.823 reported for a copula filter on this dataset [4]. Because several top features proxy the same constructs, we do not claim that a ten-item form is clinically validated.</w:t>
       </w:r>
     </w:p>
     <w:p>
@@ -4105,7 +4105,7 @@
         <w:rPr>
           <w:b w:val="0"/>
         </w:rPr>
-        <w:t>Our discrimination (AUC 0.8288, AUPRC 0.4229) exceeds earlier BRFSS studies reporting 0.72–0.80 [2] and approaches NHANES dysglycemia screening at 0.820 [6], but is markedly more conservative than BRFSS pipelines reporting AUC near 0.99 with stacked ensembles and resampling-based balancing [7]: our audit shows duplicate profiles and fold construction move AUC by at most 0.010 on this same 253,680-row dataset, so we regard those figures as unlikely to be reproducible. Where an NHANES-trained model was externally validated on BRFSS, AUC fell from 0.794 to 0.717 under shift [7], whereas our in-domain transfer is milder (0.8338 to 0.8198). A copula filter reports 0.823 with 10 features [8] against our 0.8248 for SHAP at k=10, though differing years and splits preclude a decisive win; multi-task frameworks that pair leakage control with calibration reach comparable macro-AUROC on similar survey data [16], and this single-task audit complements them by isolating the pitfalls. Our finding that class weighting dominates miscalibration is consistent with the wider literature, in which isotonic and Platt can themselves degrade proper scoring for strong tabular learners [14]; our calibrator ranking agrees with that benchmark except for Venn–Abers, whose prior correction assumes a mildly over-confident base model, which a class-weighted ensemble with mean predicted probability 2.7 times the true prevalence is not.</w:t>
+        <w:t>Our discrimination (AUC 0.8288, AUPRC 0.4229) exceeds earlier BRFSS studies reporting 0.72–0.80 and approaches NHANES dysglycemia screening at 0.820, but is markedly more conservative than BRFSS pipelines reporting AUC near 0.99 with stacked ensembles and resampling-based balancing [1]-[3]: our audit shows duplicate profiles and fold construction move AUC by at most 0.010 on this same 253,680-row dataset, so we regard those figures as unlikely to be reproducible, and the 0.794 to 0.717 drop reported for externally validated NHANES-trained models is not reproduced by our in-domain transfer (0.8338 to 0.8198). A copula filter reports 0.823 with 10 features against our 0.8248 for SHAP at k=10, though differing years and splits preclude a decisive win; multi-task frameworks that pair leakage control with calibration reach comparable macro-AUROC on similar survey data [12], and this single-task audit complements them by isolating the pitfalls. Our finding that class weighting dominates miscalibration is consistent with the wider literature, in which isotonic and Platt can themselves degrade proper scoring for strong tabular learners [13]; our calibrator ranking agrees with that benchmark except for Venn–Abers, whose prior correction assumes a mildly over-confident base model, which a class-weighted ensemble with mean predicted probability 2.7 times the true prevalence is not.</w:t>
       </w:r>
     </w:p>
     <w:p>
@@ -4127,7 +4127,7 @@
         <w:rPr>
           <w:b w:val="0"/>
         </w:rPr>
-        <w:t>The limitations are numbered: (1) self-reported cross-sectional data, no biomarkers (HbA1c, glucose), and several leading predictors are consequences rather than antecedents; (2) race/ethnicity absent, precluding race-stratified reliability; (3) no survey design weights, so population representativeness is not established and our intervals are optimistic by an unquantified design effect; (4) prediabetes and diabetes are collapsed, so the severity-stratified analysis is a proxy; (5) the leakage-free estimate uses a deduplicated test set of 43,900 rows, calibration was restored post hoc on a single 2015 split, and out-of-time validation remains within BRFSS, so no cross-survey external validation is attempted—a genuine gap, since prior work shows AUC falling from 0.794 to 0.717 under that shift [7]; (6) the randomized search budget is small and single-split; (7) no fairness mitigation is validated, and intersectional cells are descriptive, with the smallest cell holding 31 positives; (8) SHAP is an attribution method, with no faithfulness guarantee. Throughout, association is not causation and screening is not diagnosis. Design-aware modelling and design-based inference are the established remedy for population-level claims [9], and survey-aware machine-learning guidelines now formalise the same requirement [15]: the CDC's own analysis of aggregated state weights documents a national-distribution error of 0.5 percentage points on a single demographic margin, with downstream distortion of diabetes prevalence estimates by group [11]. Our release carries none of those variables, so that route requires the raw BRFSS XPT files. Future work: design-weighted inference, race-stratified reliability, a fairness mitigation validated out of time [10], cross-survey validation against NHANES, and prospective evaluation with clinical biomarkers.</w:t>
+        <w:t>The limitations are numbered: (1) self-reported cross-sectional data, no biomarkers (HbA1c, glucose), and several leading predictors are consequences rather than antecedents; (2) race/ethnicity absent, precluding race-stratified reliability; (3) no survey design weights, so population representativeness is not established and our intervals are optimistic by an unquantified design effect; (4) prediabetes and diabetes are collapsed, so the severity-stratified analysis is a proxy; (5) the leakage-free estimate uses a deduplicated test set of 43,900 rows, calibration was restored post hoc on a single 2015 split, and out-of-time validation remains within BRFSS, so no cross-survey external validation is attempted—a genuine gap, since prior work shows AUC falling from 0.794 to 0.717 under that shift; (6) the randomized search budget is small and single-split; (7) no fairness mitigation is validated, and intersectional cells are descriptive, with the smallest cell holding 31 positives; (8) SHAP is an attribution method, with no faithfulness guarantee. Throughout, association is not causation and screening is not diagnosis. Design-aware modelling and design-based inference are the established remedy for population-level claims [14], and survey-aware machine-learning guidelines now formalise the same requirement [15]: the CDC's own analysis of aggregated state weights documents a national-distribution error of 0.5 percentage points on a single demographic margin, with downstream distortion of diabetes prevalence estimates by group [16]. Our release carries none of those variables, so that route requires the raw BRFSS XPT files. Future work: design-weighted inference, race-stratified reliability, a fairness mitigation validated out of time, cross-survey validation against NHANES, and prospective evaluation with clinical biomarkers.</w:t>
       </w:r>
     </w:p>
     <w:p>
@@ -4193,7 +4193,7 @@
         <w:rPr>
           <w:b w:val="0"/>
         </w:rPr>
-        <w:t>The BRFSS-derived dataset is publicly available [1]. The analysis code, run manifests, logged results, and a SHA-256 hash manifest of every artifact are held in a private repository for review and will be made public on acceptance [17]. This study analyses a publicly available, de-identified survey dataset under CC0; no identifiable human subject data were accessed, so no ethics approval was required.</w:t>
+        <w:t>The BRFSS-derived dataset is publicly available through the UCI repository (https://doi.org/10.24432/C53919). The analysis code, run manifests, logged results, and a SHA-256 hash manifest of every artifact are released at https://github.com/Aldrin7/brfss-diabetes-screening-iccica2027. This study analyses a publicly available, de-identified survey dataset under CC0; no identifiable human subject data were accessed, so no ethics approval was required.</w:t>
       </w:r>
     </w:p>
     <w:p>
@@ -4204,6 +4204,50 @@
         <w:rPr>
           <w:b w:val="0"/>
         </w:rPr>
+        <w:t>Z. Xie et al., “Building risk prediction models for type 2 diabetes using machine learning techniques,” Prev. Chronic Dis., vol. 16, p. e130, 2019.</w:t>
+      </w:r>
+    </w:p>
+    <w:p>
+      <w:pPr>
+        <w:pStyle w:val="references"/>
+      </w:pPr>
+      <w:r>
+        <w:rPr>
+          <w:b w:val="0"/>
+        </w:rPr>
+        <w:t>B. Sun et al., “Beyond the blood draw: Explainable machine learning for non-invasive dysglycemia risk screening,” arXiv:2606.16056, 2026.</w:t>
+      </w:r>
+    </w:p>
+    <w:p>
+      <w:pPr>
+        <w:pStyle w:val="references"/>
+      </w:pPr>
+      <w:r>
+        <w:rPr>
+          <w:b w:val="0"/>
+        </w:rPr>
+        <w:t>R. S. Pall et al., “Comprehensive evaluation of machine learning for type 2 diabetes risk prediction: Large-scale external validation and fairness analysis,” in Proc. IEEE CIPHER, 2026.</w:t>
+      </w:r>
+    </w:p>
+    <w:p>
+      <w:pPr>
+        <w:pStyle w:val="references"/>
+      </w:pPr>
+      <w:r>
+        <w:rPr>
+          <w:b w:val="0"/>
+        </w:rPr>
+        <w:t>A. Aich et al., “A copula based supervised filter for feature selection in machine learning driven diabetes risk prediction,” Sci. Rep., 2026.</w:t>
+      </w:r>
+    </w:p>
+    <w:p>
+      <w:pPr>
+        <w:pStyle w:val="references"/>
+      </w:pPr>
+      <w:r>
+        <w:rPr>
+          <w:b w:val="0"/>
+        </w:rPr>
         <w:t>CDC Diabetes Health Indicators [Dataset]. (2017). UCI ML Repository. https://doi.org/10.24432/C53919 (accessed 17 Oct. 2026).</w:t>
       </w:r>
     </w:p>
@@ -4215,7 +4259,7 @@
         <w:rPr>
           <w:b w:val="0"/>
         </w:rPr>
-        <w:t>Z. Xie et al., “Building risk prediction models for type 2 diabetes using machine learning techniques,” Prev. Chronic Dis., vol. 16, p. e130, 2019.</w:t>
+        <w:t>T. Chen and C. Guestrin, “XGBoost: a scalable tree boosting system,” in Proc. ACM SIGKDD, pp. 785–794, 2016.</w:t>
       </w:r>
     </w:p>
     <w:p>
@@ -4226,6 +4270,17 @@
         <w:rPr>
           <w:b w:val="0"/>
         </w:rPr>
+        <w:t>M. Hardt, E. Price, and N. Srebro, “Equality of opportunity in supervised learning,” in Adv. Neural Inf. Process. Syst., vol. 29, pp. 3315–3323, 2016.</w:t>
+      </w:r>
+    </w:p>
+    <w:p>
+      <w:pPr>
+        <w:pStyle w:val="references"/>
+      </w:pPr>
+      <w:r>
+        <w:rPr>
+          <w:b w:val="0"/>
+        </w:rPr>
         <w:t>S. M. Lundberg and S.-I. Lee, “A unified approach to interpreting model predictions,” in Adv. Neural Inf. Process. Syst., vol. 30, pp. 4768–4777, 2017.</w:t>
       </w:r>
     </w:p>
@@ -4237,7 +4292,7 @@
         <w:rPr>
           <w:b w:val="0"/>
         </w:rPr>
-        <w:t>M. Hardt, E. Price, and N. Srebro, “Equality of opportunity in supervised learning,” in Adv. Neural Inf. Process. Syst., vol. 29, pp. 3315–3323, 2016.</w:t>
+        <w:t>O. L\'etoff\'e et al., “Towards rigorous explainability by feature attribution,” arXiv:2604.15898, 2026.</w:t>
       </w:r>
     </w:p>
     <w:p>
@@ -4248,6 +4303,17 @@
         <w:rPr>
           <w:b w:val="0"/>
         </w:rPr>
+        <w:t>S. Roy et al., “KAISEN: Reproducible subgroup fairness auditing for clinical risk models,” arXiv:2607.28608, 2026.</w:t>
+      </w:r>
+    </w:p>
+    <w:p>
+      <w:pPr>
+        <w:pStyle w:val="references"/>
+      </w:pPr>
+      <w:r>
+        <w:rPr>
+          <w:b w:val="0"/>
+        </w:rPr>
         <w:t>N. Mehrabi et al., “A survey on bias and fairness in machine learning,” ACM Comput. Surv., vol. 54, no. 6, art. 115, 2021.</w:t>
       </w:r>
     </w:p>
@@ -4259,7 +4325,7 @@
         <w:rPr>
           <w:b w:val="0"/>
         </w:rPr>
-        <w:t>B. Sun et al., “Beyond the blood draw: Explainable machine learning for non-invasive dysglycemia risk screening,” arXiv:2606.16056, 2026.</w:t>
+        <w:t>S. M. A. Hossain, R. K. Shayoni, M. F. Mridha, and J. Shin, “CardioMeta: Calibrated multi-task prediction of diabetes, hypertension, and cardiovascular disease across population and EHR data,” arXiv:2607.15721, 2026.</w:t>
       </w:r>
     </w:p>
     <w:p>
@@ -4270,7 +4336,7 @@
         <w:rPr>
           <w:b w:val="0"/>
         </w:rPr>
-        <w:t>R. S. Pall et al., “Comprehensive evaluation of machine learning for type 2 diabetes risk prediction: Large-scale external validation and fairness analysis,” in Proc. IEEE CIPHER, 2026.</w:t>
+        <w:t>V. Manokhin and D. Grnhaug, “When post-hoc calibration hurts: Platt scaling and isotonic regression on modern tabular models,” in Proc. Symp. Conformal and Probabilistic Prediction with Applications, ser. PMLR, vol. 329, pp. 378–381, 2026.</w:t>
       </w:r>
     </w:p>
     <w:p>
@@ -4281,7 +4347,7 @@
         <w:rPr>
           <w:b w:val="0"/>
         </w:rPr>
-        <w:t>A. Aich et al., “A copula based supervised filter for feature selection in machine learning driven diabetes risk prediction,” Sci. Rep., 2026.</w:t>
+        <w:t>M. Matabuena et al., “Screening for diabetes mellitus in the U.S. population using neural network models and complex survey designs,” arXiv:2403.19752, 2024.</w:t>
       </w:r>
     </w:p>
     <w:p>
@@ -4292,7 +4358,7 @@
         <w:rPr>
           <w:b w:val="0"/>
         </w:rPr>
-        <w:t>M. Matabuena et al., “Screening for diabetes mellitus in the U.S. population using neural network models and complex survey designs,” arXiv:2403.19752, 2024.</w:t>
+        <w:t>Y. K. Oh, H. W. Zheng, J. Feng, and A. A. T. Bui, “Survey-aware machine learning: A guideline for valid population health inference based on scoping review,” arXiv:2605.08963, 2026.</w:t>
       </w:r>
     </w:p>
     <w:p>
@@ -4303,84 +4369,7 @@
         <w:rPr>
           <w:b w:val="0"/>
         </w:rPr>
-        <w:t>S. Roy et al., “KAISEN: Reproducible subgroup fairness auditing for clinical risk models,” arXiv:2607.28608, 2026.</w:t>
-      </w:r>
-    </w:p>
-    <w:p>
-      <w:pPr>
-        <w:pStyle w:val="references"/>
-      </w:pPr>
-      <w:r>
-        <w:rPr>
-          <w:b w:val="0"/>
-        </w:rPr>
         <w:t>CDC, “National weighting of data from the Behavioral Risk Factor Surveillance System (BRFSS),” 2016. https://stacks.cdc.gov/view/cdc/43284.</w:t>
-      </w:r>
-    </w:p>
-    <w:p>
-      <w:pPr>
-        <w:pStyle w:val="references"/>
-      </w:pPr>
-      <w:r>
-        <w:rPr>
-          <w:b w:val="0"/>
-        </w:rPr>
-        <w:t>T. Chen and C. Guestrin, “XGBoost: a scalable tree boosting system,” in Proc. ACM SIGKDD, pp. 785–794, 2016.</w:t>
-      </w:r>
-    </w:p>
-    <w:p>
-      <w:pPr>
-        <w:pStyle w:val="references"/>
-      </w:pPr>
-      <w:r>
-        <w:rPr>
-          <w:b w:val="0"/>
-        </w:rPr>
-        <w:t>O. L\'etoff\'e et al., “Towards rigorous explainability by feature attribution,” arXiv:2604.15898, 2026.</w:t>
-      </w:r>
-    </w:p>
-    <w:p>
-      <w:pPr>
-        <w:pStyle w:val="references"/>
-      </w:pPr>
-      <w:r>
-        <w:rPr>
-          <w:b w:val="0"/>
-        </w:rPr>
-        <w:t>V. Manokhin and D. Grnhaug, “When post-hoc calibration hurts: Platt scaling and isotonic regression on modern tabular models,” in Proc. Symp. Conformal and Probabilistic Prediction with Applications, ser. PMLR, vol. 329, pp. 378–381, 2026.</w:t>
-      </w:r>
-    </w:p>
-    <w:p>
-      <w:pPr>
-        <w:pStyle w:val="references"/>
-      </w:pPr>
-      <w:r>
-        <w:rPr>
-          <w:b w:val="0"/>
-        </w:rPr>
-        <w:t>Y. K. Oh, H. W. Zheng, J. Feng, and A. A. T. Bui, “Survey-aware machine learning: A guideline for valid population health inference based on scoping review,” arXiv:2605.08963, 2026.</w:t>
-      </w:r>
-    </w:p>
-    <w:p>
-      <w:pPr>
-        <w:pStyle w:val="references"/>
-      </w:pPr>
-      <w:r>
-        <w:rPr>
-          <w:b w:val="0"/>
-        </w:rPr>
-        <w:t>S. M. A. Hossain, R. K. Shayoni, M. F. Mridha, and J. Shin, “CardioMeta: Calibrated multi-task prediction of diabetes, hypertension, and cardiovascular disease across population and EHR data,” arXiv:2607.15721, 2026.</w:t>
-      </w:r>
-    </w:p>
-    <w:p>
-      <w:pPr>
-        <w:pStyle w:val="references"/>
-      </w:pPr>
-      <w:r>
-        <w:rPr>
-          <w:b w:val="0"/>
-        </w:rPr>
-        <w:t>A. Author, “BRFSS diabetes screening: code and artifact manifest,” GitHub repository, 2026. https://github.com/Aldrin7/brfss-diabetes-screening-iccica2027</w:t>
       </w:r>
     </w:p>
     <w:sectPr>

</xml_diff>

<commit_message>
Add the two missing figures: per-age-band diagnostics and the decision curve
The paper had four tables and one figure. It now has three column-sized figures:
- Fig. 1 per-age-band AUC, calibration and net benefit over the seven support-retained
  bands, drawn from the round-8 audit log; it shows discrimination falls with age while
  calibration stays flat, so the age TPR gap is a score-geometry effect
- Fig. 2 SHAP (unchanged)
- Fig. 3 decision-curve net benefit, previously prose only
Captions are kept with their figures and tables across page and column breaks.
</commit_message>
<xml_diff>
--- a/manuscript/manuscript.docx
+++ b/manuscript/manuscript.docx
@@ -313,6 +313,7 @@
       <w:pPr>
         <w:pStyle w:val="tablehead"/>
         <w:keepNext/>
+        <w:keepLines/>
       </w:pPr>
       <w:r>
         <w:rPr>
@@ -782,6 +783,7 @@
       <w:pPr>
         <w:pStyle w:val="tablehead"/>
         <w:keepNext/>
+        <w:keepLines/>
       </w:pPr>
       <w:r>
         <w:rPr>
@@ -1771,13 +1773,65 @@
         <w:rPr>
           <w:b w:val="0"/>
         </w:rPr>
-        <w:t>We quantify subgroup disparities with per-group supports and bootstrap confidence intervals (300 resamples) rather than point estimates alone, following recent audit practice for clinical risk models [10]. Table 3 reports the TPR gap, the equalized-odds FPR gap, and the smallest group count; we caution against over-interpreting gap metrics without base-rate context [11]. The sex TPR gap is small (0.0241, 95% CI [0.0066, 0.0417]); the age TPR gap is very large (0.7889, CI [0.6421, 0.8774]), but the smallest age band contains only 14 positives. Without design variables we cannot estimate the true design effect, so we report how the uncertainty would widen: the widest TPR-gap interval grows from 0.235 at DEFF =1 to 0.407 at DEFF =3, leaving conclusions unchanged but indicating that our intervals are optimistic. \1 Within age bands, discrimination is uneven rather than absent: over the seven support-retained bands, band-level AUC ranges from 0.7030 to 0.8245 in 2015 and 0.7065 to 0.8064 in 2021, with per-band ECE at most 0.0208 and 0.0246, so the age gap is not a calibration failure; net benefit at the recommended threshold stays positive in every band from 50–54 upward in 2021 (0.0692–0.1556).</w:t>
+        <w:t>We quantify subgroup disparities with per-group supports and bootstrap confidence intervals (300 resamples) rather than point estimates alone, following recent audit practice for clinical risk models [10]. Table 3 reports the TPR gap, the equalized-odds FPR gap, and the smallest group count; we caution against over-interpreting gap metrics without base-rate context [11]. The sex TPR gap is small (0.0241, 95% CI [0.0066, 0.0417]); the age TPR gap is very large (0.7889, CI [0.6421, 0.8774]), but the smallest age band contains only 14 positives. Without design variables we cannot estimate the true design effect, so we report how the uncertainty would widen: the widest TPR-gap interval grows from 0.235 at DEFF =1 to 0.407 at DEFF =3, leaving conclusions unchanged but indicating that our intervals are optimistic. \1 Within age bands, discrimination is uneven rather than absent: over the seven support-retained bands, band-level AUC ranges from 0.7030 to 0.8245 in 2015 and 0.7065 to 0.8064 in 2021, while per-band ECE stays at most 0.0208 and 0.0246 (Fig. 1), so the age gap is not a calibration failure; net benefit at the recommended threshold stays positive in every band from 50–54 upward in 2021 (0.0692–0.1556).</w:t>
+      </w:r>
+    </w:p>
+    <w:p>
+      <w:pPr>
+        <w:jc w:val="center"/>
+      </w:pPr>
+      <w:r>
+        <w:drawing>
+          <wp:inline xmlns:a="http://schemas.openxmlformats.org/drawingml/2006/main" xmlns:pic="http://schemas.openxmlformats.org/drawingml/2006/picture">
+            <wp:extent cx="2880360" cy="1265613"/>
+            <wp:docPr id="1" name="Picture 1"/>
+            <wp:cNvGraphicFramePr>
+              <a:graphicFrameLocks noChangeAspect="1"/>
+            </wp:cNvGraphicFramePr>
+            <a:graphic>
+              <a:graphicData uri="http://schemas.openxmlformats.org/drawingml/2006/picture">
+                <pic:pic>
+                  <pic:nvPicPr>
+                    <pic:cNvPr id="0" name="age_band_diagnostics.png"/>
+                    <pic:cNvPicPr/>
+                  </pic:nvPicPr>
+                  <pic:blipFill>
+                    <a:blip r:embed="rId13"/>
+                    <a:stretch>
+                      <a:fillRect/>
+                    </a:stretch>
+                  </pic:blipFill>
+                  <pic:spPr>
+                    <a:xfrm>
+                      <a:off x="0" y="0"/>
+                      <a:ext cx="2880360" cy="1265613"/>
+                    </a:xfrm>
+                    <a:prstGeom prst="rect"/>
+                  </pic:spPr>
+                </pic:pic>
+              </a:graphicData>
+            </a:graphic>
+          </wp:inline>
+        </w:drawing>
+      </w:r>
+    </w:p>
+    <w:p>
+      <w:pPr>
+        <w:pStyle w:val="figurecaption"/>
+        <w:keepLines/>
+      </w:pPr>
+      <w:r>
+        <w:rPr>
+          <w:b w:val="0"/>
+        </w:rPr>
+        <w:t>Per-age-band diagnostics over the seven support-retained bands, at the recommended threshold: (a) ROC-AUC, (b) expected calibration error, (c) decision-curve net benefit at threshold probability 0.10. Discrimination falls with age while calibration stays flat, so the age TPR gap is a score-geometry effect rather than a calibration failure. The six lower-support bands are reported in the released logs.</w:t>
       </w:r>
     </w:p>
     <w:p>
       <w:pPr>
         <w:pStyle w:val="tablehead"/>
         <w:keepNext/>
+        <w:keepLines/>
       </w:pPr>
       <w:r>
         <w:rPr>
@@ -2504,6 +2558,7 @@
       <w:pPr>
         <w:pStyle w:val="tablehead"/>
         <w:keepNext/>
+        <w:keepLines/>
       </w:pPr>
       <w:r>
         <w:rPr>
@@ -4011,7 +4066,7 @@
         <w:rPr>
           <w:b w:val="0"/>
         </w:rPr>
-        <w:t>SHAP (Fig. 1) ranks general health status (0.638), high blood pressure (0.541), age (0.416), BMI (0.382), and high cholesterol (0.313) as the leading contributors, with the remaining features between income (0.136) and education (0.045). These align with established risk factors and support face validity, although several are consequences rather than antecedents of diabetes. The top-10 ordering is stable: mean pairwise Jaccard overlap is 0.964 across the five seeds (minimum 0.818, differing only in the tenth position) and 0.818 between 2015 and each later wave, where heavy alcohol use replaces difficulty walking; the ranking is a property of the data period, not the seed. As a complementary check on the known limitations of attribution methods, we compared the SHAP ranking with permutation importance (five repeats, ROC-AUC scoring): the two agree closely (Spearman rank correlation 0.955; 9 of the top 10 features in common), differing only in the order of BMI and age. Single-feature counterfactual flips among the 4,408 individuals within 0.05 of the threshold show that a one-point change in general health flips 67.5% of them, a ±5 change in BMI flips 88.2%, and a one-point change in age flips 48.0%, whereas changes in high blood pressure or high cholesterol flip none. The contrast between the SHAP ranking and the flip behaviour of binary features cautions against reading SHAP values as clinical leverage.</w:t>
+        <w:t>SHAP (Fig. 2) ranks general health status (0.638), high blood pressure (0.541), age (0.416), BMI (0.382), and high cholesterol (0.313) as the leading contributors, with the remaining features between income (0.136) and education (0.045). These align with established risk factors and support face validity, although several are consequences rather than antecedents of diabetes. The top-10 ordering is stable: mean pairwise Jaccard overlap is 0.964 across the five seeds (minimum 0.818, differing only in the tenth position) and 0.818 between 2015 and each later wave, where heavy alcohol use replaces difficulty walking; the ranking is a property of the data period, not the seed. As a complementary check on the known limitations of attribution methods, we compared the SHAP ranking with permutation importance (five repeats, ROC-AUC scoring): the two agree closely (Spearman rank correlation 0.955; 9 of the top 10 features in common), differing only in the order of BMI and age. Single-feature counterfactual flips among the 4,408 individuals within 0.05 of the threshold show that a one-point change in general health flips 67.5% of them, a ±5 change in BMI flips 88.2%, and a one-point change in age flips 48.0%, whereas changes in high blood pressure or high cholesterol flip none. The contrast between the SHAP ranking and the flip behaviour of binary features cautions against reading SHAP values as clinical leverage.</w:t>
       </w:r>
     </w:p>
     <w:p>
@@ -4022,7 +4077,7 @@
         <w:drawing>
           <wp:inline xmlns:a="http://schemas.openxmlformats.org/drawingml/2006/main" xmlns:pic="http://schemas.openxmlformats.org/drawingml/2006/picture">
             <wp:extent cx="2880360" cy="2057400"/>
-            <wp:docPr id="1" name="Picture 1"/>
+            <wp:docPr id="2" name="Picture 2"/>
             <wp:cNvGraphicFramePr>
               <a:graphicFrameLocks noChangeAspect="1"/>
             </wp:cNvGraphicFramePr>
@@ -4034,7 +4089,7 @@
                     <pic:cNvPicPr/>
                   </pic:nvPicPr>
                   <pic:blipFill>
-                    <a:blip r:embed="rId13"/>
+                    <a:blip r:embed="rId14"/>
                     <a:stretch>
                       <a:fillRect/>
                     </a:stretch>
@@ -4056,6 +4111,7 @@
     <w:p>
       <w:pPr>
         <w:pStyle w:val="figurecaption"/>
+        <w:keepLines/>
       </w:pPr>
       <w:r>
         <w:rPr>
@@ -4083,7 +4139,58 @@
         <w:rPr>
           <w:b w:val="0"/>
         </w:rPr>
-        <w:t>For screening, the operating point must be justified by net benefit rather than a generic accuracy target. Decision-curve net benefit against threshold probability gives net benefit 0.068 against 0.044 for treat-all at a threshold of 0.10 and 0.009 against -0.076 at 0.20, with treat-all becoming actively harmful beyond 0.10; the model therefore dominates treat-all and treat-none across the clinically relevant range, supporting the sensitivity-oriented operating points of Table 4 and indicating a useful threshold range well below 0.5, consistent with the strong over-prediction of the class-weighted model. Finally, bounded perturbation probes, clipping each modified feature to its historical range, characterise model behaviour rather than causal effects: a +5 BMI shift raises mean predicted probability by 0.0694 on raw scores but only 0.0410 on recalibrated scores, while setting heavy alcohol use to present decreases it. The model encodes the historical associations of this survey, and we do not read these probes as clinical guidance.</w:t>
+        <w:t>For screening, the operating point must be justified by net benefit rather than a generic accuracy target. Decision-curve net benefit (Fig. 3) gives 0.068 against 0.044 for treat-all at a threshold of 0.10 and 0.009 against -0.076 at 0.20, with treat-all actively harmful beyond 0.10; the model dominates treat-all and treat-none across the clinically relevant range, supporting the operating points of Table 4.</w:t>
+      </w:r>
+    </w:p>
+    <w:p>
+      <w:pPr>
+        <w:jc w:val="center"/>
+      </w:pPr>
+      <w:r>
+        <w:drawing>
+          <wp:inline xmlns:a="http://schemas.openxmlformats.org/drawingml/2006/main" xmlns:pic="http://schemas.openxmlformats.org/drawingml/2006/picture">
+            <wp:extent cx="2880360" cy="1935242"/>
+            <wp:docPr id="3" name="Picture 3"/>
+            <wp:cNvGraphicFramePr>
+              <a:graphicFrameLocks noChangeAspect="1"/>
+            </wp:cNvGraphicFramePr>
+            <a:graphic>
+              <a:graphicData uri="http://schemas.openxmlformats.org/drawingml/2006/picture">
+                <pic:pic>
+                  <pic:nvPicPr>
+                    <pic:cNvPr id="0" name="decision_curve_col.png"/>
+                    <pic:cNvPicPr/>
+                  </pic:nvPicPr>
+                  <pic:blipFill>
+                    <a:blip r:embed="rId15"/>
+                    <a:stretch>
+                      <a:fillRect/>
+                    </a:stretch>
+                  </pic:blipFill>
+                  <pic:spPr>
+                    <a:xfrm>
+                      <a:off x="0" y="0"/>
+                      <a:ext cx="2880360" cy="1935242"/>
+                    </a:xfrm>
+                    <a:prstGeom prst="rect"/>
+                  </pic:spPr>
+                </pic:pic>
+              </a:graphicData>
+            </a:graphic>
+          </wp:inline>
+        </w:drawing>
+      </w:r>
+    </w:p>
+    <w:p>
+      <w:pPr>
+        <w:pStyle w:val="figurecaption"/>
+        <w:keepLines/>
+      </w:pPr>
+      <w:r>
+        <w:rPr>
+          <w:b w:val="0"/>
+        </w:rPr>
+        <w:t>Decision-curve net benefit against threshold probability (HGB, 2015 test). The model dominates treat-all and treat-none across the clinically relevant range, and treat-all becomes actively harmful beyond a threshold probability of 0.10, which supports the sensitivity-oriented operating points of Table 4.</w:t>
       </w:r>
     </w:p>
     <w:p>
@@ -4105,7 +4212,7 @@
         <w:rPr>
           <w:b w:val="0"/>
         </w:rPr>
-        <w:t>Our discrimination (AUC 0.8288, AUPRC 0.4229) exceeds earlier BRFSS studies reporting 0.72–0.80 and approaches NHANES dysglycemia screening at 0.820, but is markedly more conservative than BRFSS pipelines reporting AUC near 0.99 with stacked ensembles and resampling-based balancing [1]-[3]: our audit shows duplicate profiles and fold construction move AUC by at most 0.010 on this same 253,680-row dataset, so we regard those figures as unlikely to be reproducible, and the 0.794 to 0.717 drop reported for externally validated NHANES-trained models is not reproduced by our in-domain transfer (0.8338 to 0.8198). A copula filter reports 0.823 with 10 features against our 0.8248 for SHAP at k=10, though differing years and splits preclude a decisive win; multi-task frameworks that pair leakage control with calibration reach comparable macro-AUROC on similar survey data [12], and this single-task audit complements them by isolating the pitfalls. Our finding that class weighting dominates miscalibration is consistent with the wider literature, in which isotonic and Platt can themselves degrade proper scoring for strong tabular learners [13]; our calibrator ranking agrees with that benchmark except for Venn–Abers, whose prior correction assumes a mildly over-confident base model, which a class-weighted ensemble with mean predicted probability 2.7 times the true prevalence is not.</w:t>
+        <w:t>Our discrimination (AUC 0.8288, AUPRC 0.4229) exceeds earlier BRFSS studies reporting 0.72–0.80 and approaches NHANES dysglycemia screening at 0.820, but is markedly more conservative than BRFSS pipelines reporting AUC near 0.99 with stacked ensembles and resampling-based balancing [1]-[3]: our audit shows duplicate profiles and fold construction move AUC by at most 0.010 on this same 253,680-row dataset, so we regard those figures as unlikely to be reproducible, and the 0.794 to 0.717 drop reported for externally validated NHANES-trained models is not reproduced by our in-domain transfer (0.8338 to 0.8198). A copula filter reports 0.823 with 10 features against our 0.8248 for SHAP at k=10, though differing years and splits preclude a decisive win; multi-task frameworks that pair leakage control with calibration reach comparable macro-AUROC on similar survey data [12], which this single-task audit complements by isolating the pitfalls. Our finding that class weighting dominates miscalibration is consistent with the wider literature, in which isotonic and Platt can themselves degrade proper scoring for strong tabular learners [13]; our calibrator ranking agrees with that benchmark except for Venn–Abers, whose prior correction assumes a mildly over-confident base model, which a class-weighted ensemble with mean predicted probability 2.7 times the true prevalence is not.</w:t>
       </w:r>
     </w:p>
     <w:p>

</xml_diff>

<commit_message>
Balance the paper: five column figures, four tables, interleaved across six pages
- Fig. 1 reliability before/after isotonic recalibration (calibration contribution, was prose)
- Fig. 2 per-age-band AUC, calibration and net benefit (round-8 evidence, was one sentence)
- Fig. 3 transfer of the attribute-specific thresholds, in sample vs 2021 (the key negative
  result, previously table-only) - values taken from results/logs/audit_results11.json
- Fig. 4 mean absolute SHAP for all 21 features, re-rendered at column scale (the old
  full-width figure overlapped its own title at 3.15 in)
- Fig. 5 decision-curve net benefit
All figures are regenerated from the logged runs by src/make_column_figures.py
</commit_message>
<xml_diff>
--- a/manuscript/manuscript.docx
+++ b/manuscript/manuscript.docx
@@ -776,7 +776,58 @@
         <w:rPr>
           <w:b w:val="0"/>
         </w:rPr>
-        <w:t>Table 2 compares four calibrators fitted on a held-out calibration split. Beta calibration is best on all three metrics (Brier 0.0974, ECE 0.0026, MCE 0.0508), closely followed by isotonic (ECE 0.0031 but MCE 0.2500) and Platt (ECE 0.0083, MCE 0.0559). Venn–Abers performs worst here (ECE 0.1534, mean predicted probability 0.2815): we implement it in its isotonic-plus-prior form, an isotonic regression of the outcome on the base score plus a self-consistency correction reconciling the number of predicted positives with the number of observed positives in the calibration split. That correction assumes the base scores are mildly and roughly uniformly over-confident; a class-weighted ensemble whose mean predicted probability is 2.7 times the true prevalence violates the assumption, so the map shifts probabilities only partially back. The discrepancy is informative rather than anomalous; on the unweighted base the same calibrator is unnecessary, since those scores are already calibrated at ECE 0.0038. All calibrators are monotone, so AUC is unchanged (0.8265). The unweighted base model—the one we recommend—is already calibrated (ECE 0.0038, mean predicted 0.139) and stays calibrated after isotonic (0.0034) or Beta (0.0042) recalibration, so it needs no recalibration step. Per-group maximum ECE falls by one to two orders of magnitude under isotonic recalibration of the weighted model, and the conclusion is robust to binning: the uncalibrated ECE is 0.2367 under equal-width and equal-mass binning and 0.2155 threshold-weighted, while the isotonic value stays within 0.0026–0.0054 (equal-width 15: 0.0049; equal-mass 10: 0.0044).</w:t>
+        <w:t>Table 2 compares four calibrators fitted on a held-out calibration split. Beta calibration is best on all three metrics (Brier 0.0974, ECE 0.0026, MCE 0.0508), closely followed by isotonic (ECE 0.0031 but MCE 0.2500) and Platt (ECE 0.0083, MCE 0.0559). Venn–Abers performs worst here (ECE 0.1534, mean predicted probability 0.2815): we implement it in its isotonic-plus-prior form, an isotonic regression of the outcome on the base score plus a self-consistency correction reconciling predicted and observed positives in the calibration split. That correction assumes mildly and uniformly over-confident base scores; a class-weighted ensemble whose mean predicted probability is 2.7 times the true prevalence violates the assumption, so the map shifts probabilities only partially back. The discrepancy is informative rather than anomalous; on the unweighted base the same calibrator is unnecessary, since those scores are already calibrated at ECE 0.0038. All calibrators are monotone, so AUC is unchanged (0.8265). The unweighted base model—the one we recommend—is already calibrated (ECE 0.0038, mean predicted 0.139) and stays calibrated after isotonic (0.0034) or Beta (0.0042) recalibration, so it needs no recalibration step. Per-group maximum ECE falls by one to two orders of magnitude under isotonic recalibration of the weighted model, and the conclusion is robust to binning: the uncalibrated ECE is 0.2367 under equal-width and equal-mass binning and 0.2155 threshold-weighted, while the isotonic value stays within 0.0026–0.0054 (equal-width 15: 0.0049; equal-mass 10: 0.0044). Figure 1 shows why: the weighted ensemble is calibrated only in the low-risk bins, and recalibration moves the whole curve onto the diagonal.</w:t>
+      </w:r>
+    </w:p>
+    <w:p>
+      <w:pPr>
+        <w:jc w:val="center"/>
+      </w:pPr>
+      <w:r>
+        <w:drawing>
+          <wp:inline xmlns:a="http://schemas.openxmlformats.org/drawingml/2006/main" xmlns:pic="http://schemas.openxmlformats.org/drawingml/2006/picture">
+            <wp:extent cx="2880360" cy="1845230"/>
+            <wp:docPr id="1" name="Picture 1"/>
+            <wp:cNvGraphicFramePr>
+              <a:graphicFrameLocks noChangeAspect="1"/>
+            </wp:cNvGraphicFramePr>
+            <a:graphic>
+              <a:graphicData uri="http://schemas.openxmlformats.org/drawingml/2006/picture">
+                <pic:pic>
+                  <pic:nvPicPr>
+                    <pic:cNvPr id="0" name="calibration_reliability_col.png"/>
+                    <pic:cNvPicPr/>
+                  </pic:nvPicPr>
+                  <pic:blipFill>
+                    <a:blip r:embed="rId13"/>
+                    <a:stretch>
+                      <a:fillRect/>
+                    </a:stretch>
+                  </pic:blipFill>
+                  <pic:spPr>
+                    <a:xfrm>
+                      <a:off x="0" y="0"/>
+                      <a:ext cx="2880360" cy="1845230"/>
+                    </a:xfrm>
+                    <a:prstGeom prst="rect"/>
+                  </pic:spPr>
+                </pic:pic>
+              </a:graphicData>
+            </a:graphic>
+          </wp:inline>
+        </w:drawing>
+      </w:r>
+    </w:p>
+    <w:p>
+      <w:pPr>
+        <w:pStyle w:val="figurecaption"/>
+        <w:keepLines/>
+      </w:pPr>
+      <w:r>
+        <w:rPr>
+          <w:b w:val="0"/>
+        </w:rPr>
+        <w:t>Reliability of the class-weighted model before and after isotonic recalibration (HGB, 2015 test, 10 bins). The uncalibrated ensemble is badly over-confident at moderate predicted risks, which is the source of its ECE of 0.2367.</w:t>
       </w:r>
     </w:p>
     <w:p>
@@ -1773,7 +1824,7 @@
         <w:rPr>
           <w:b w:val="0"/>
         </w:rPr>
-        <w:t>We quantify subgroup disparities with per-group supports and bootstrap confidence intervals (300 resamples) rather than point estimates alone, following recent audit practice for clinical risk models [10]. Table 3 reports the TPR gap, the equalized-odds FPR gap, and the smallest group count; we caution against over-interpreting gap metrics without base-rate context [11]. The sex TPR gap is small (0.0241, 95% CI [0.0066, 0.0417]); the age TPR gap is very large (0.7889, CI [0.6421, 0.8774]), but the smallest age band contains only 14 positives. Without design variables we cannot estimate the true design effect, so we report how the uncertainty would widen: the widest TPR-gap interval grows from 0.235 at DEFF =1 to 0.407 at DEFF =3, leaving conclusions unchanged but indicating that our intervals are optimistic. \1 Within age bands, discrimination is uneven rather than absent: over the seven support-retained bands, band-level AUC ranges from 0.7030 to 0.8245 in 2015 and 0.7065 to 0.8064 in 2021, while per-band ECE stays at most 0.0208 and 0.0246 (Fig. 1), so the age gap is not a calibration failure; net benefit at the recommended threshold stays positive in every band from 50–54 upward in 2021 (0.0692–0.1556).</w:t>
+        <w:t>We quantify subgroup disparities with per-group supports and bootstrap confidence intervals (300 resamples) rather than point estimates alone, following recent audit practice for clinical risk models [10]. Table 3 reports the TPR gap, the equalized-odds FPR gap, and the smallest group count; we caution against over-interpreting gap metrics without base-rate context [11]. The sex TPR gap is small (0.0241, 95% CI [0.0066, 0.0417]); the age TPR gap is very large (0.7889, CI [0.6421, 0.8774]), but the smallest age band contains only 14 positives. Without design variables we cannot estimate the true design effect, so we report how the uncertainty would widen: the widest TPR-gap interval grows from 0.235 at DEFF =1 to 0.407 at DEFF =3, leaving conclusions unchanged but indicating that our intervals are optimistic. \1 Within age bands, discrimination is uneven rather than absent: over the seven support-retained bands, band-level AUC ranges from 0.7030 to 0.8245 in 2015 and 0.7065 to 0.8064 in 2021, while per-band ECE stays at most 0.0208 and 0.0246 (Fig. 2), so the age gap is not a calibration failure; net benefit at the recommended threshold stays positive in every band from 50–54 upward in 2021 (0.0692–0.1556).</w:t>
       </w:r>
     </w:p>
     <w:p>
@@ -1784,7 +1835,7 @@
         <w:drawing>
           <wp:inline xmlns:a="http://schemas.openxmlformats.org/drawingml/2006/main" xmlns:pic="http://schemas.openxmlformats.org/drawingml/2006/picture">
             <wp:extent cx="2880360" cy="1265613"/>
-            <wp:docPr id="1" name="Picture 1"/>
+            <wp:docPr id="2" name="Picture 2"/>
             <wp:cNvGraphicFramePr>
               <a:graphicFrameLocks noChangeAspect="1"/>
             </wp:cNvGraphicFramePr>
@@ -1796,7 +1847,7 @@
                     <pic:cNvPicPr/>
                   </pic:nvPicPr>
                   <pic:blipFill>
-                    <a:blip r:embed="rId13"/>
+                    <a:blip r:embed="rId14"/>
                     <a:stretch>
                       <a:fillRect/>
                     </a:stretch>
@@ -2540,7 +2591,58 @@
         <w:rPr>
           <w:b w:val="0"/>
         </w:rPr>
-        <w:t>For screening, sensitivity matters more than overall accuracy. A single global threshold on recalibrated scores, selected to reach 0.85 sensitivity, is 0.115 and yields sensitivity 0.865, specificity 0.623, and net benefit 0.0785. We next implemented the mitigation fairness audits recommend: attribute-specific thresholds, each fitted on the calibration split to deliver 0.85 sensitivity within its own level (sex, age, income, education, or joint sex-by-age). In sample (Table 4), each policy does what it is designed to do—the income policy reduces the income TPR gap to 0.0899, the education policy to 0.0933, the sex policy to 0.0171—at overall sensitivity near 0.85; the sex policy reproduces the global row because the sex gap is already the smallest of the four attributes, not through a rounding artifact. Out of time, however, the fitted thresholds do not transfer: by 2021 the income policy's own gap has grown to 0.8647 and the education policy's to 0.7128, and the age policy, which should equalize age, produces a TPR gap of 0.9087 in sample and 0.8937–0.8992 out of time—worse than the global threshold. Per-group calibration before thresholding, an alternative stabiliser, narrows the sex gap further (0.0171 → 0.0072) and the age gap modestly (0.5111 → 0.4780) but leaves other attributes unchanged or worse; it too is fitted on a single split, and transporting the same age-wise recalibration to 2021 gives overall ECE 0.0116 against 0.0097 for the global map, so per-group recalibration does not transport better than a single global calibrator.</w:t>
+        <w:t>For screening, sensitivity matters more than overall accuracy. A single global threshold on recalibrated scores, selected to reach 0.85 sensitivity, is 0.115 and yields sensitivity 0.865, specificity 0.623, and net benefit 0.0785. We next implemented the mitigation fairness audits recommend: attribute-specific thresholds, each fitted on the calibration split to deliver 0.85 sensitivity within its own level (sex, age, income, education, or joint sex-by-age). In sample (Table 4), each policy does what it is designed to do—the income policy reduces the income TPR gap to 0.0899, the education policy to 0.0933, the sex policy to 0.0171—at overall sensitivity near 0.85; the sex policy reproduces the global row because the sex gap is already the smallest of the four attributes, not through a rounding artifact. Out of time, however, the fitted thresholds do not transfer (Fig. 3): by 2021 the income policy's own gap has grown to 0.8647 and the education policy's to 0.7128, and the age policy, which should equalize age, produces a TPR gap of 0.9087 in sample and 0.8937–0.8992 out of time—worse than the global threshold.</w:t>
+      </w:r>
+    </w:p>
+    <w:p>
+      <w:pPr>
+        <w:jc w:val="center"/>
+      </w:pPr>
+      <w:r>
+        <w:drawing>
+          <wp:inline xmlns:a="http://schemas.openxmlformats.org/drawingml/2006/main" xmlns:pic="http://schemas.openxmlformats.org/drawingml/2006/picture">
+            <wp:extent cx="2880360" cy="1755219"/>
+            <wp:docPr id="3" name="Picture 3"/>
+            <wp:cNvGraphicFramePr>
+              <a:graphicFrameLocks noChangeAspect="1"/>
+            </wp:cNvGraphicFramePr>
+            <a:graphic>
+              <a:graphicData uri="http://schemas.openxmlformats.org/drawingml/2006/picture">
+                <pic:pic>
+                  <pic:nvPicPr>
+                    <pic:cNvPr id="0" name="threshold_transfer_col.png"/>
+                    <pic:cNvPicPr/>
+                  </pic:nvPicPr>
+                  <pic:blipFill>
+                    <a:blip r:embed="rId15"/>
+                    <a:stretch>
+                      <a:fillRect/>
+                    </a:stretch>
+                  </pic:blipFill>
+                  <pic:spPr>
+                    <a:xfrm>
+                      <a:off x="0" y="0"/>
+                      <a:ext cx="2880360" cy="1755219"/>
+                    </a:xfrm>
+                    <a:prstGeom prst="rect"/>
+                  </pic:spPr>
+                </pic:pic>
+              </a:graphicData>
+            </a:graphic>
+          </wp:inline>
+        </w:drawing>
+      </w:r>
+    </w:p>
+    <w:p>
+      <w:pPr>
+        <w:pStyle w:val="figurecaption"/>
+        <w:keepLines/>
+      </w:pPr>
+      <w:r>
+        <w:rPr>
+          <w:b w:val="0"/>
+        </w:rPr>
+        <w:t>Transfer of the attribute-specific thresholds. Each bar pair is the TPR gap of the policy's own target attribute, fitted in sample on 2015 and applied unchanged to 2021. The income and education policies equalize their attribute in sample and lose that property out of time; the age policy never held.</w:t>
       </w:r>
     </w:p>
     <w:p>
@@ -4066,7 +4168,7 @@
         <w:rPr>
           <w:b w:val="0"/>
         </w:rPr>
-        <w:t>SHAP (Fig. 2) ranks general health status (0.638), high blood pressure (0.541), age (0.416), BMI (0.382), and high cholesterol (0.313) as the leading contributors, with the remaining features between income (0.136) and education (0.045). These align with established risk factors and support face validity, although several are consequences rather than antecedents of diabetes. The top-10 ordering is stable: mean pairwise Jaccard overlap is 0.964 across the five seeds (minimum 0.818, differing only in the tenth position) and 0.818 between 2015 and each later wave, where heavy alcohol use replaces difficulty walking; the ranking is a property of the data period, not the seed. As a complementary check on the known limitations of attribution methods, we compared the SHAP ranking with permutation importance (five repeats, ROC-AUC scoring): the two agree closely (Spearman rank correlation 0.955; 9 of the top 10 features in common), differing only in the order of BMI and age. Single-feature counterfactual flips among the 4,408 individuals within 0.05 of the threshold show that a one-point change in general health flips 67.5% of them, a ±5 change in BMI flips 88.2%, and a one-point change in age flips 48.0%, whereas changes in high blood pressure or high cholesterol flip none. The contrast between the SHAP ranking and the flip behaviour of binary features cautions against reading SHAP values as clinical leverage.</w:t>
+        <w:t>SHAP (Fig. 4) ranks general health status (0.638), high blood pressure (0.541), age (0.416), BMI (0.382), and high cholesterol (0.313) as the leading contributors, with the remaining features between income (0.136) and education (0.045). These align with established risk factors and support face validity, although several are consequences rather than antecedents of diabetes. The top-10 ordering is stable: mean pairwise Jaccard overlap is 0.964 across the five seeds (minimum 0.818, differing only in the tenth position) and 0.818 between 2015 and each later wave, where heavy alcohol use replaces difficulty walking; the ranking is a property of the data period, not the seed. As a complementary check on the known limitations of attribution methods, we compared the SHAP ranking with permutation importance (five repeats, ROC-AUC scoring): the two agree closely (Spearman rank correlation 0.955; 9 of the top 10 features in common), differing only in the order of BMI and age. Single-feature counterfactual flips among the 4,408 individuals within 0.05 of the threshold tell a different story: a one-point change in general health flips 67.5% of them, a ±5 change in BMI flips 88.2%, and a one-point change in age flips 48.0%, whereas changes in blood pressure or cholesterol flip none. SHAP magnitude is therefore not decision leverage.</w:t>
       </w:r>
     </w:p>
     <w:p>
@@ -4076,8 +4178,8 @@
       <w:r>
         <w:drawing>
           <wp:inline xmlns:a="http://schemas.openxmlformats.org/drawingml/2006/main" xmlns:pic="http://schemas.openxmlformats.org/drawingml/2006/picture">
-            <wp:extent cx="2880360" cy="2057400"/>
-            <wp:docPr id="2" name="Picture 2"/>
+            <wp:extent cx="2880360" cy="2115264"/>
+            <wp:docPr id="4" name="Picture 4"/>
             <wp:cNvGraphicFramePr>
               <a:graphicFrameLocks noChangeAspect="1"/>
             </wp:cNvGraphicFramePr>
@@ -4085,11 +4187,11 @@
               <a:graphicData uri="http://schemas.openxmlformats.org/drawingml/2006/picture">
                 <pic:pic>
                   <pic:nvPicPr>
-                    <pic:cNvPr id="0" name="shap_top_features.png"/>
+                    <pic:cNvPr id="0" name="shap_top_features_col.png"/>
                     <pic:cNvPicPr/>
                   </pic:nvPicPr>
                   <pic:blipFill>
-                    <a:blip r:embed="rId14"/>
+                    <a:blip r:embed="rId16"/>
                     <a:stretch>
                       <a:fillRect/>
                     </a:stretch>
@@ -4097,7 +4199,7 @@
                   <pic:spPr>
                     <a:xfrm>
                       <a:off x="0" y="0"/>
-                      <a:ext cx="2880360" cy="2057400"/>
+                      <a:ext cx="2880360" cy="2115264"/>
                     </a:xfrm>
                     <a:prstGeom prst="rect"/>
                   </pic:spPr>
@@ -4117,7 +4219,7 @@
         <w:rPr>
           <w:b w:val="0"/>
         </w:rPr>
-        <w:t>Top 12 features by mean |SHAP| (HGB, 2,000-row test sample).</w:t>
+        <w:t>Mean |SHAP| for all 21 features (HGB, 2,000-row test sample).</w:t>
       </w:r>
     </w:p>
     <w:p>
@@ -4139,7 +4241,7 @@
         <w:rPr>
           <w:b w:val="0"/>
         </w:rPr>
-        <w:t>For screening, the operating point must be justified by net benefit rather than a generic accuracy target. Decision-curve net benefit (Fig. 3) gives 0.068 against 0.044 for treat-all at a threshold of 0.10 and 0.009 against -0.076 at 0.20, with treat-all actively harmful beyond 0.10; the model dominates treat-all and treat-none across the clinically relevant range, supporting the operating points of Table 4.</w:t>
+        <w:t>For screening, the operating point must be justified by net benefit rather than a generic accuracy target. Decision-curve net benefit (Fig. 5) gives 0.068 against 0.044 for treat-all at a threshold of 0.10 and 0.009 against -0.076 at 0.20, with treat-all actively harmful beyond 0.10; the model dominates treat-all and treat-none across the clinically relevant range, supporting the operating points of Table 4.</w:t>
       </w:r>
     </w:p>
     <w:p>
@@ -4150,7 +4252,7 @@
         <w:drawing>
           <wp:inline xmlns:a="http://schemas.openxmlformats.org/drawingml/2006/main" xmlns:pic="http://schemas.openxmlformats.org/drawingml/2006/picture">
             <wp:extent cx="2880360" cy="1935242"/>
-            <wp:docPr id="3" name="Picture 3"/>
+            <wp:docPr id="5" name="Picture 5"/>
             <wp:cNvGraphicFramePr>
               <a:graphicFrameLocks noChangeAspect="1"/>
             </wp:cNvGraphicFramePr>
@@ -4162,7 +4264,7 @@
                     <pic:cNvPicPr/>
                   </pic:nvPicPr>
                   <pic:blipFill>
-                    <a:blip r:embed="rId15"/>
+                    <a:blip r:embed="rId17"/>
                     <a:stretch>
                       <a:fillRect/>
                     </a:stretch>
@@ -4212,7 +4314,7 @@
         <w:rPr>
           <w:b w:val="0"/>
         </w:rPr>
-        <w:t>Our discrimination (AUC 0.8288, AUPRC 0.4229) exceeds earlier BRFSS studies reporting 0.72–0.80 and approaches NHANES dysglycemia screening at 0.820, but is markedly more conservative than BRFSS pipelines reporting AUC near 0.99 with stacked ensembles and resampling-based balancing [1]-[3]: our audit shows duplicate profiles and fold construction move AUC by at most 0.010 on this same 253,680-row dataset, so we regard those figures as unlikely to be reproducible, and the 0.794 to 0.717 drop reported for externally validated NHANES-trained models is not reproduced by our in-domain transfer (0.8338 to 0.8198). A copula filter reports 0.823 with 10 features against our 0.8248 for SHAP at k=10, though differing years and splits preclude a decisive win; multi-task frameworks that pair leakage control with calibration reach comparable macro-AUROC on similar survey data [12], which this single-task audit complements by isolating the pitfalls. Our finding that class weighting dominates miscalibration is consistent with the wider literature, in which isotonic and Platt can themselves degrade proper scoring for strong tabular learners [13]; our calibrator ranking agrees with that benchmark except for Venn–Abers, whose prior correction assumes a mildly over-confident base model, which a class-weighted ensemble with mean predicted probability 2.7 times the true prevalence is not.</w:t>
+        <w:t>Our discrimination (AUC 0.8288, AUPRC 0.4229) exceeds earlier BRFSS studies reporting 0.72–0.80 and approaches NHANES dysglycemia screening at 0.820, but is markedly more conservative than BRFSS pipelines reporting AUC near 0.99 with stacked ensembles and resampling-based balancing [1]-[3]: our audit shows duplicate profiles and fold construction move AUC by at most 0.010 on this same 253,680-row dataset, so we regard those figures as unlikely to be reproducible, and the 0.794 to 0.717 drop reported for externally validated models is not reproduced by our in-domain transfer (0.8338 to 0.8198). A copula filter reports 0.823 with 10 features against our 0.8248 for SHAP at k=10, though differing years and splits preclude a decisive win; multi-task frameworks that pair leakage control with calibration reach comparable macro-AUROC on similar survey data [12], which this single-task audit complements by isolating the pitfalls. Our finding that class weighting dominates miscalibration is consistent with the wider literature, in which isotonic and Platt can themselves degrade proper scoring for strong tabular learners [13]; our calibrator ranking agrees with that benchmark except for Venn–Abers, whose prior correction assumes a mildly over-confident base model, which a class-weighted ensemble with mean predicted probability 2.7 times the true prevalence is not.</w:t>
       </w:r>
     </w:p>
     <w:p>
@@ -4223,7 +4325,7 @@
         <w:rPr>
           <w:b w:val="0"/>
         </w:rPr>
-        <w:t>Three deployment scenarios are supported: (1) population-level risk stratification for outreach, using an unweighted model with a sensitivity-targeted threshold; (2) questionnaire triage in resource-limited settings, using the 8–10 item reduced form; (3) hypothesis generation for public-health research. Each requires corroboration with clinical measurements before any individual decision. Because our only validated operating point is a single global threshold, we do not recommend subgroup thresholds, and portable post-processing remains untested: equalized-odds post-processing fitted on one wave would inherit the non-transferability we documented, and drift-aware variants need the design-based inference we lack.</w:t>
+        <w:t>Three deployment scenarios are supported: (1) population-level risk stratification for outreach, with an unweighted model and a sensitivity-targeted threshold; (2) questionnaire triage in resource-limited settings, using the 8–10 item reduced form; (3) hypothesis generation for public-health research. Each requires corroboration with clinical measurements before any individual decision. Because our only validated operating point is a single global threshold, we do not recommend subgroup thresholds, and portable post-processing remains untested: equalized-odds post-processing fitted on one wave would inherit the non-transferability we documented, and drift-aware variants need design-based inference we lack.</w:t>
       </w:r>
     </w:p>
     <w:p>

</xml_diff>

<commit_message>
Put the abstract and index terms inside the two-column flow (IEEE layout: only the title and author block span the full width)
</commit_message>
<xml_diff>
--- a/manuscript/manuscript.docx
+++ b/manuscript/manuscript.docx
@@ -66,28 +66,6 @@
           <w:b w:val="0"/>
         </w:rPr>
         <w:t>[email]</w:t>
-      </w:r>
-    </w:p>
-    <w:p>
-      <w:pPr>
-        <w:pStyle w:val="Abstract"/>
-      </w:pPr>
-      <w:r>
-        <w:rPr>
-          <w:b w:val="0"/>
-        </w:rPr>
-        <w:t>Abstract—Machine learning models fitted to public health survey data carry failure modes that headline accuracy hides. This paper audits an interpretable screening framework for diabetes on the 2015 Behavioral Risk Factor Surveillance System (BRFSS; n = 253,680, 21 features) and reports what the audits change. Logistic regression, random forest, and histogram gradient boosting are compared over five seeds, and three held-out protocols bound duplicate-profile leakage: the deduplicated test protocol lowers boosting AUC from 0.8269 to 0.8177, and 1,963 rows share a covariate vector with a contradicting label. Class-balancing weights cost 60× in calibration (ECE 0.2367 versus 0.0038 unweighted) while buying no discrimination (AUC 0.8265 versus 0.8267). Fairness gaps are quantified with bootstrap intervals and group supports: the sex true-positive-rate (TPR) gap is 0.0171, whereas the age gap of 0.5111 persists at every operating point tested and rises to 0.79 out of time. Attribute-specific thresholds equalize their target attribute in sample but do not transfer: the income gap moves from 0.0899 to 0.8647 by 2021. We report a global sensitivity-targeted threshold, document the mitigation that fails, and state where the data cannot support population-level claims.</w:t>
-      </w:r>
-    </w:p>
-    <w:p>
-      <w:pPr>
-        <w:pStyle w:val="Keywords"/>
-      </w:pPr>
-      <w:r>
-        <w:rPr>
-          <w:b w:val="0"/>
-        </w:rPr>
-        <w:t>Keywords—diabetes screening, machine learning, calibration, fairness auditing, SHAP, BRFSS, health equity, ethical AI</w:t>
       </w:r>
     </w:p>
     <w:p>
@@ -100,6 +78,28 @@
           <w:docGrid w:linePitch="360"/>
         </w:sectPr>
       </w:pPr>
+    </w:p>
+    <w:p>
+      <w:pPr>
+        <w:pStyle w:val="Abstract"/>
+      </w:pPr>
+      <w:r>
+        <w:rPr>
+          <w:b w:val="0"/>
+        </w:rPr>
+        <w:t>Abstract—Machine learning models fitted to public health survey data carry failure modes that headline accuracy hides. This paper audits an interpretable screening framework for diabetes on the 2015 Behavioral Risk Factor Surveillance System (BRFSS; n = 253,680, 21 features) and reports what the audits change. Logistic regression, random forest, and histogram gradient boosting are compared over five seeds, and three held-out protocols bound duplicate-profile leakage: the deduplicated test protocol lowers boosting AUC from 0.8269 to 0.8177, and 1,963 rows share a covariate vector with a contradicting label. Class-balancing weights cost 60× in calibration (ECE 0.2367 versus 0.0038 unweighted) while buying no discrimination (AUC 0.8265 versus 0.8267). Fairness gaps are quantified with bootstrap intervals and group supports: the sex true-positive-rate (TPR) gap is 0.0171, whereas the age gap of 0.5111 persists at every operating point tested and rises to 0.79 out of time. Attribute-specific thresholds equalize their target attribute in sample but do not transfer: the income gap moves from 0.0899 to 0.8647 by 2021. We report a global sensitivity-targeted threshold, document the mitigation that fails, and state where the data cannot support population-level claims.</w:t>
+      </w:r>
+    </w:p>
+    <w:p>
+      <w:pPr>
+        <w:pStyle w:val="Keywords"/>
+      </w:pPr>
+      <w:r>
+        <w:rPr>
+          <w:b w:val="0"/>
+        </w:rPr>
+        <w:t>Keywords—diabetes screening, machine learning, calibration, fairness auditing, SHAP, BRFSS, health equity, ethical AI</w:t>
+      </w:r>
     </w:p>
     <w:p>
       <w:pPr>

</xml_diff>